<commit_message>
Review report: data protection dimension and findings F-25 to F-35; master prompt: data section 6.12, question 14, data reviewer and acceptance check
Co-authored-by: ravislr-beep <ravislr-beep@users.noreply.github.com>
</commit_message>
<xml_diff>
--- a/runbook/out/Runbook_Expert_Review.docx
+++ b/runbook/out/Runbook_Expert_Review.docx
@@ -33,7 +33,7 @@
           <w:color w:val="1F3864"/>
           <w:sz w:val="28"/>
         </w:rPr>
-        <w:t>Version 2.0 reviewed; corrections issued as version 2.1</w:t>
+        <w:t>Version 2.0 reviewed and corrected as 2.1; data review of 2.1 issued as 2.2</w:t>
       </w:r>
     </w:p>
     <w:p>
@@ -74,6 +74,11 @@
     <w:p>
       <w:r>
         <w:t>The other findings were gaps rather than errors: availability zone design, Confluent's enforced connection and request limits, the installer's possible need for Kafka, Okta key rotation and rate limits, OpenSearch sizing formulas, performance testing, sizing and observability. Version 2.1 corrects every finding. Seven items remain open because only the customer, Pega Support or a DEV test can close them (Section 6).</w:t>
+      </w:r>
+    </w:p>
+    <w:p>
+      <w:r>
+        <w:t>A second review of version 2.1 looked at the data itself: what Pega puts on Kafka and into OpenSearch, how sensitive it is, and how it is protected, kept, erased and recovered. It found eleven gaps (F-25 to F-35). The most serious were three choices that are fixed when a resource is created: the Confluent encryption key mode, whose Enterprise variant needs a Key Vault reachable from all networks; AKS encryption at host, without which logs and heap dumps sit on unencrypted ephemeral disks; and the data class of the shared PERF and PREPROD services. Version 2.2 adds Section 9 to the runbook to close them.</w:t>
       </w:r>
     </w:p>
     <w:p>
@@ -280,7 +285,7 @@
               <w:rPr>
                 <w:sz w:val="19"/>
               </w:rPr>
-              <w:t>9</w:t>
+              <w:t>14</w:t>
             </w:r>
           </w:p>
         </w:tc>
@@ -333,7 +338,7 @@
               <w:rPr>
                 <w:sz w:val="19"/>
               </w:rPr>
-              <w:t>10</w:t>
+              <w:t>15</w:t>
             </w:r>
           </w:p>
         </w:tc>
@@ -389,7 +394,7 @@
               <w:rPr>
                 <w:sz w:val="19"/>
               </w:rPr>
-              <w:t>2</w:t>
+              <w:t>3</w:t>
             </w:r>
           </w:p>
         </w:tc>
@@ -471,7 +476,7 @@
         <w:pStyle w:val="ListBullet"/>
       </w:pPr>
       <w:r>
-        <w:t>Rechecked Confluent, OpenSearch, Okta, Azure and Pega pages for limits, conditions and defaults, and added fifteen references (R49 to R63 in the runbook).</w:t>
+        <w:t>Rechecked Confluent, OpenSearch, Okta, Azure and Pega pages for limits, conditions and defaults, and added fifteen references (R49 to R63 in the runbook). The data review added sixteen more (R64 to R79) on queue processor payloads, SRS indexing scope, Pega encryption, Confluent keys and TLS, OpenSearch TLS and audit logs, and AKS disk encryption.</w:t>
       </w:r>
     </w:p>
     <w:p>
@@ -1198,7 +1203,7 @@
               <w:rPr>
                 <w:sz w:val="17"/>
               </w:rPr>
-              <w:t>Section 14</w:t>
+              <w:t>Section 15</w:t>
             </w:r>
           </w:p>
         </w:tc>
@@ -1267,7 +1272,7 @@
               <w:rPr>
                 <w:sz w:val="17"/>
               </w:rPr>
-              <w:t>Section 15</w:t>
+              <w:t>Section 16</w:t>
             </w:r>
           </w:p>
         </w:tc>
@@ -1482,7 +1487,7 @@
               <w:rPr>
                 <w:sz w:val="17"/>
               </w:rPr>
-              <w:t>Sections 12 and 19</w:t>
+              <w:t>Sections 13 and 20</w:t>
             </w:r>
           </w:p>
         </w:tc>
@@ -1625,6 +1630,75 @@
                 <w:sz w:val="17"/>
               </w:rPr>
               <w:t>QA script; ID check; page review</w:t>
+            </w:r>
+          </w:p>
+        </w:tc>
+      </w:tr>
+      <w:tr>
+        <w:trPr>
+          <w:cantSplit w:val="true"/>
+        </w:trPr>
+        <w:tc>
+          <w:tcPr>
+            <w:tcW w:type="dxa" w:w="624"/>
+          </w:tcPr>
+          <w:p>
+            <w:pPr>
+              <w:spacing w:after="20" w:line="240" w:lineRule="auto"/>
+            </w:pPr>
+            <w:r>
+              <w:rPr>
+                <w:sz w:val="17"/>
+              </w:rPr>
+              <w:t>D15</w:t>
+            </w:r>
+          </w:p>
+        </w:tc>
+        <w:tc>
+          <w:tcPr>
+            <w:tcW w:type="dxa" w:w="1928"/>
+          </w:tcPr>
+          <w:p>
+            <w:pPr>
+              <w:spacing w:after="20" w:line="240" w:lineRule="auto"/>
+            </w:pPr>
+            <w:r>
+              <w:rPr>
+                <w:sz w:val="17"/>
+              </w:rPr>
+              <w:t>Data flows and data protection</w:t>
+            </w:r>
+          </w:p>
+        </w:tc>
+        <w:tc>
+          <w:tcPr>
+            <w:tcW w:type="dxa" w:w="3969"/>
+          </w:tcPr>
+          <w:p>
+            <w:pPr>
+              <w:spacing w:after="20" w:line="240" w:lineRule="auto"/>
+            </w:pPr>
+            <w:r>
+              <w:rPr>
+                <w:sz w:val="17"/>
+              </w:rPr>
+              <w:t>What Pega puts on Kafka and into OpenSearch, its class, encryption in transit and at rest, operational copies, residency, retention, erasure and failure handling</w:t>
+            </w:r>
+          </w:p>
+        </w:tc>
+        <w:tc>
+          <w:tcPr>
+            <w:tcW w:type="dxa" w:w="2891"/>
+          </w:tcPr>
+          <w:p>
+            <w:pPr>
+              <w:spacing w:after="20" w:line="240" w:lineRule="auto"/>
+            </w:pPr>
+            <w:r>
+              <w:rPr>
+                <w:sz w:val="17"/>
+              </w:rPr>
+              <w:t>R7, R33, R58, R64 to R79; Section 9</w:t>
             </w:r>
           </w:p>
         </w:tc>
@@ -1647,6 +1721,11 @@
       </w:pPr>
       <w:r>
         <w:t>4  Findings and corrections</w:t>
+      </w:r>
+    </w:p>
+    <w:p>
+      <w:r>
+        <w:t>F-01 to F-24 were found in version 2.0 and corrected in 2.1; F-25 to F-35 were found in 2.1 and corrected in 2.2. The evidence column names the version where the problem was found. Section numbers in the correction column are those of version 2.2, in which Sections 9 to 20 of version 2.1 became Sections 10 to 21.</w:t>
       </w:r>
     </w:p>
     <w:p>
@@ -1766,7 +1845,7 @@
                 <w:color w:val="FFFFFF"/>
                 <w:sz w:val="15"/>
               </w:rPr>
-              <w:t>Finding in version 2.0</w:t>
+              <w:t>Finding</w:t>
             </w:r>
           </w:p>
         </w:tc>
@@ -1804,7 +1883,7 @@
                 <w:color w:val="FFFFFF"/>
                 <w:sz w:val="15"/>
               </w:rPr>
-              <w:t>Correction in version 2.1</w:t>
+              <w:t>Correction</w:t>
             </w:r>
           </w:p>
         </w:tc>
@@ -1970,7 +2049,7 @@
               <w:rPr>
                 <w:sz w:val="15"/>
               </w:rPr>
-              <w:t>. Sections 7.7 and 9.3, Appendix B</w:t>
+              <w:t>. Sections 7.7 and 10.3, Appendix B</w:t>
             </w:r>
           </w:p>
         </w:tc>
@@ -3709,7 +3788,7 @@
               <w:rPr>
                 <w:sz w:val="15"/>
               </w:rPr>
-              <w:t xml:space="preserve">Section 9.2 subsection; </w:t>
+              <w:t xml:space="preserve">Section 10.2 subsection; </w:t>
             </w:r>
             <w:r>
               <w:rPr>
@@ -3824,7 +3903,7 @@
               <w:rPr>
                 <w:sz w:val="15"/>
               </w:rPr>
-              <w:t>CD-16; Section 18.3</w:t>
+              <w:t>CD-16; Section 19.3</w:t>
             </w:r>
           </w:p>
         </w:tc>
@@ -3931,7 +4010,7 @@
               <w:rPr>
                 <w:sz w:val="15"/>
               </w:rPr>
-              <w:t>New Section 15 with harness figure and six measurement points; RK-16</w:t>
+              <w:t>New Section 16 with harness figure and six measurement points; RK-16</w:t>
             </w:r>
           </w:p>
         </w:tc>
@@ -4032,7 +4111,7 @@
               <w:rPr>
                 <w:sz w:val="15"/>
               </w:rPr>
-              <w:t>Sections 15.7 to 15.9; Excel calculator with live formulas, checked by recalculation</w:t>
+              <w:t>Sections 16.7 to 16.9; Excel calculator with live formulas, checked by recalculation</w:t>
             </w:r>
           </w:p>
         </w:tc>
@@ -4139,7 +4218,7 @@
               <w:rPr>
                 <w:sz w:val="15"/>
               </w:rPr>
-              <w:t>New Section 18 with telemetry pipeline figure; alert table extended from 12 to 19 signals</w:t>
+              <w:t>New Section 19 with telemetry pipeline figure; alert table extended from 12 to 19 signals</w:t>
             </w:r>
           </w:p>
         </w:tc>
@@ -4240,7 +4319,7 @@
               <w:rPr>
                 <w:sz w:val="15"/>
               </w:rPr>
-              <w:t>Section 12.10 with build waves figure, exit check per wave and a 13-item checklist</w:t>
+              <w:t>Section 13.10 with build waves figure, exit check per wave and a 13-item checklist</w:t>
             </w:r>
           </w:p>
         </w:tc>
@@ -4564,6 +4643,1175 @@
                 <w:sz w:val="15"/>
               </w:rPr>
               <w:t>14 new known-issue rows, including a new Platform table; 5 new failure scenarios</w:t>
+            </w:r>
+          </w:p>
+        </w:tc>
+      </w:tr>
+      <w:tr>
+        <w:trPr>
+          <w:cantSplit w:val="true"/>
+        </w:trPr>
+        <w:tc>
+          <w:tcPr>
+            <w:tcW w:type="dxa" w:w="624"/>
+          </w:tcPr>
+          <w:p>
+            <w:pPr>
+              <w:spacing w:after="20" w:line="240" w:lineRule="auto"/>
+            </w:pPr>
+            <w:r>
+              <w:rPr>
+                <w:sz w:val="15"/>
+              </w:rPr>
+              <w:t>F-25</w:t>
+            </w:r>
+          </w:p>
+        </w:tc>
+        <w:tc>
+          <w:tcPr>
+            <w:tcW w:type="dxa" w:w="680"/>
+          </w:tcPr>
+          <w:p>
+            <w:pPr>
+              <w:spacing w:after="20" w:line="240" w:lineRule="auto"/>
+            </w:pPr>
+            <w:r>
+              <w:rPr>
+                <w:sz w:val="15"/>
+              </w:rPr>
+              <w:t>D15</w:t>
+            </w:r>
+          </w:p>
+        </w:tc>
+        <w:tc>
+          <w:tcPr>
+            <w:tcW w:type="dxa" w:w="907"/>
+          </w:tcPr>
+          <w:p>
+            <w:pPr>
+              <w:spacing w:after="20" w:line="240" w:lineRule="auto"/>
+            </w:pPr>
+            <w:r>
+              <w:rPr>
+                <w:sz w:val="15"/>
+              </w:rPr>
+              <w:t>High</w:t>
+            </w:r>
+          </w:p>
+        </w:tc>
+        <w:tc>
+          <w:tcPr>
+            <w:tcW w:type="dxa" w:w="3175"/>
+          </w:tcPr>
+          <w:p>
+            <w:pPr>
+              <w:spacing w:after="20" w:line="240" w:lineRule="auto"/>
+            </w:pPr>
+            <w:r>
+              <w:rPr>
+                <w:sz w:val="15"/>
+              </w:rPr>
+              <w:t>No statement of what Pega actually sends to Kafka and OpenSearch. Queue messages carry the producer's operator, access group and application, and either a record key or the whole page; SRS indexes only listed properties unless a DSS widens it.</w:t>
+            </w:r>
+          </w:p>
+        </w:tc>
+        <w:tc>
+          <w:tcPr>
+            <w:tcW w:type="dxa" w:w="1928"/>
+          </w:tcPr>
+          <w:p>
+            <w:pPr>
+              <w:spacing w:after="20" w:line="240" w:lineRule="auto"/>
+            </w:pPr>
+            <w:r>
+              <w:rPr>
+                <w:sz w:val="15"/>
+              </w:rPr>
+              <w:t>v2.1; R64, R65, R67, R68</w:t>
+            </w:r>
+          </w:p>
+        </w:tc>
+        <w:tc>
+          <w:tcPr>
+            <w:tcW w:type="dxa" w:w="2098"/>
+          </w:tcPr>
+          <w:p>
+            <w:pPr>
+              <w:spacing w:after="20" w:line="240" w:lineRule="auto"/>
+            </w:pPr>
+            <w:r>
+              <w:rPr>
+                <w:sz w:val="15"/>
+              </w:rPr>
+              <w:t>Section 9.1 with data flow figure and a 14-item data inventory</w:t>
+            </w:r>
+          </w:p>
+        </w:tc>
+      </w:tr>
+      <w:tr>
+        <w:trPr>
+          <w:cantSplit w:val="true"/>
+        </w:trPr>
+        <w:tc>
+          <w:tcPr>
+            <w:tcW w:type="dxa" w:w="624"/>
+            <w:shd w:val="clear" w:color="auto" w:fill="F2F5FA"/>
+          </w:tcPr>
+          <w:p>
+            <w:pPr>
+              <w:spacing w:after="20" w:line="240" w:lineRule="auto"/>
+            </w:pPr>
+            <w:r>
+              <w:rPr>
+                <w:sz w:val="15"/>
+              </w:rPr>
+              <w:t>F-26</w:t>
+            </w:r>
+          </w:p>
+        </w:tc>
+        <w:tc>
+          <w:tcPr>
+            <w:tcW w:type="dxa" w:w="680"/>
+            <w:shd w:val="clear" w:color="auto" w:fill="F2F5FA"/>
+          </w:tcPr>
+          <w:p>
+            <w:pPr>
+              <w:spacing w:after="20" w:line="240" w:lineRule="auto"/>
+            </w:pPr>
+            <w:r>
+              <w:rPr>
+                <w:sz w:val="15"/>
+              </w:rPr>
+              <w:t>D15</w:t>
+            </w:r>
+          </w:p>
+        </w:tc>
+        <w:tc>
+          <w:tcPr>
+            <w:tcW w:type="dxa" w:w="907"/>
+            <w:shd w:val="clear" w:color="auto" w:fill="F2F5FA"/>
+          </w:tcPr>
+          <w:p>
+            <w:pPr>
+              <w:spacing w:after="20" w:line="240" w:lineRule="auto"/>
+            </w:pPr>
+            <w:r>
+              <w:rPr>
+                <w:sz w:val="15"/>
+              </w:rPr>
+              <w:t>High</w:t>
+            </w:r>
+          </w:p>
+        </w:tc>
+        <w:tc>
+          <w:tcPr>
+            <w:tcW w:type="dxa" w:w="3175"/>
+            <w:shd w:val="clear" w:color="auto" w:fill="F2F5FA"/>
+          </w:tcPr>
+          <w:p>
+            <w:pPr>
+              <w:spacing w:after="20" w:line="240" w:lineRule="auto"/>
+            </w:pPr>
+            <w:r>
+              <w:rPr>
+                <w:sz w:val="15"/>
+              </w:rPr>
+              <w:t>No data class per environment group. NP2 is shared by PERF and PREPROD; an unmasked PREPROD would put production personal data on a shared service reachable by its administrators.</w:t>
+            </w:r>
+          </w:p>
+        </w:tc>
+        <w:tc>
+          <w:tcPr>
+            <w:tcW w:type="dxa" w:w="1928"/>
+            <w:shd w:val="clear" w:color="auto" w:fill="F2F5FA"/>
+          </w:tcPr>
+          <w:p>
+            <w:pPr>
+              <w:spacing w:after="20" w:line="240" w:lineRule="auto"/>
+            </w:pPr>
+            <w:r>
+              <w:rPr>
+                <w:sz w:val="15"/>
+              </w:rPr>
+              <w:t>v2.1 Sections 5 and 10.5</w:t>
+            </w:r>
+          </w:p>
+        </w:tc>
+        <w:tc>
+          <w:tcPr>
+            <w:tcW w:type="dxa" w:w="2098"/>
+            <w:shd w:val="clear" w:color="auto" w:fill="F2F5FA"/>
+          </w:tcPr>
+          <w:p>
+            <w:pPr>
+              <w:spacing w:after="20" w:line="240" w:lineRule="auto"/>
+            </w:pPr>
+            <w:r>
+              <w:rPr>
+                <w:sz w:val="15"/>
+              </w:rPr>
+              <w:t>Section 9.2; OD-15 (mask both); RK-18</w:t>
+            </w:r>
+          </w:p>
+        </w:tc>
+      </w:tr>
+      <w:tr>
+        <w:trPr>
+          <w:cantSplit w:val="true"/>
+        </w:trPr>
+        <w:tc>
+          <w:tcPr>
+            <w:tcW w:type="dxa" w:w="624"/>
+          </w:tcPr>
+          <w:p>
+            <w:pPr>
+              <w:spacing w:after="20" w:line="240" w:lineRule="auto"/>
+            </w:pPr>
+            <w:r>
+              <w:rPr>
+                <w:sz w:val="15"/>
+              </w:rPr>
+              <w:t>F-27</w:t>
+            </w:r>
+          </w:p>
+        </w:tc>
+        <w:tc>
+          <w:tcPr>
+            <w:tcW w:type="dxa" w:w="680"/>
+          </w:tcPr>
+          <w:p>
+            <w:pPr>
+              <w:spacing w:after="20" w:line="240" w:lineRule="auto"/>
+            </w:pPr>
+            <w:r>
+              <w:rPr>
+                <w:sz w:val="15"/>
+              </w:rPr>
+              <w:t>D15</w:t>
+            </w:r>
+          </w:p>
+        </w:tc>
+        <w:tc>
+          <w:tcPr>
+            <w:tcW w:type="dxa" w:w="907"/>
+          </w:tcPr>
+          <w:p>
+            <w:pPr>
+              <w:spacing w:after="20" w:line="240" w:lineRule="auto"/>
+            </w:pPr>
+            <w:r>
+              <w:rPr>
+                <w:sz w:val="15"/>
+              </w:rPr>
+              <w:t>Medium</w:t>
+            </w:r>
+          </w:p>
+        </w:tc>
+        <w:tc>
+          <w:tcPr>
+            <w:tcW w:type="dxa" w:w="3175"/>
+          </w:tcPr>
+          <w:p>
+            <w:pPr>
+              <w:spacing w:after="20" w:line="240" w:lineRule="auto"/>
+            </w:pPr>
+            <w:r>
+              <w:rPr>
+                <w:sz w:val="15"/>
+              </w:rPr>
+              <w:t xml:space="preserve">No controls to limit the data copied: the queue snapshot option, the indexed property list, </w:t>
+            </w:r>
+            <w:r>
+              <w:rPr>
+                <w:rFonts w:ascii="Consolas" w:hAnsi="Consolas"/>
+                <w:color w:val="1F3864"/>
+                <w:sz w:val="15"/>
+              </w:rPr>
+              <w:t>indexer/srs/indexAllFieldsForFTS</w:t>
+            </w:r>
+            <w:r>
+              <w:rPr>
+                <w:sz w:val="15"/>
+              </w:rPr>
+              <w:t xml:space="preserve"> and PropertyEncrypt policies.</w:t>
+            </w:r>
+          </w:p>
+        </w:tc>
+        <w:tc>
+          <w:tcPr>
+            <w:tcW w:type="dxa" w:w="1928"/>
+          </w:tcPr>
+          <w:p>
+            <w:pPr>
+              <w:spacing w:after="20" w:line="240" w:lineRule="auto"/>
+            </w:pPr>
+            <w:r>
+              <w:rPr>
+                <w:sz w:val="15"/>
+              </w:rPr>
+              <w:t>R64, R67, R68, R71</w:t>
+            </w:r>
+          </w:p>
+        </w:tc>
+        <w:tc>
+          <w:tcPr>
+            <w:tcW w:type="dxa" w:w="2098"/>
+          </w:tcPr>
+          <w:p>
+            <w:pPr>
+              <w:spacing w:after="20" w:line="240" w:lineRule="auto"/>
+            </w:pPr>
+            <w:r>
+              <w:rPr>
+                <w:sz w:val="15"/>
+              </w:rPr>
+              <w:t>Section 9.3; DT-01, DT-03, DT-04; GQ-09</w:t>
+            </w:r>
+          </w:p>
+        </w:tc>
+      </w:tr>
+      <w:tr>
+        <w:trPr>
+          <w:cantSplit w:val="true"/>
+        </w:trPr>
+        <w:tc>
+          <w:tcPr>
+            <w:tcW w:type="dxa" w:w="624"/>
+            <w:shd w:val="clear" w:color="auto" w:fill="F2F5FA"/>
+          </w:tcPr>
+          <w:p>
+            <w:pPr>
+              <w:spacing w:after="20" w:line="240" w:lineRule="auto"/>
+            </w:pPr>
+            <w:r>
+              <w:rPr>
+                <w:sz w:val="15"/>
+              </w:rPr>
+              <w:t>F-28</w:t>
+            </w:r>
+          </w:p>
+        </w:tc>
+        <w:tc>
+          <w:tcPr>
+            <w:tcW w:type="dxa" w:w="680"/>
+            <w:shd w:val="clear" w:color="auto" w:fill="F2F5FA"/>
+          </w:tcPr>
+          <w:p>
+            <w:pPr>
+              <w:spacing w:after="20" w:line="240" w:lineRule="auto"/>
+            </w:pPr>
+            <w:r>
+              <w:rPr>
+                <w:sz w:val="15"/>
+              </w:rPr>
+              <w:t>D15, D6</w:t>
+            </w:r>
+          </w:p>
+        </w:tc>
+        <w:tc>
+          <w:tcPr>
+            <w:tcW w:type="dxa" w:w="907"/>
+            <w:shd w:val="clear" w:color="auto" w:fill="F2F5FA"/>
+          </w:tcPr>
+          <w:p>
+            <w:pPr>
+              <w:spacing w:after="20" w:line="240" w:lineRule="auto"/>
+            </w:pPr>
+            <w:r>
+              <w:rPr>
+                <w:sz w:val="15"/>
+              </w:rPr>
+              <w:t>High</w:t>
+            </w:r>
+          </w:p>
+        </w:tc>
+        <w:tc>
+          <w:tcPr>
+            <w:tcW w:type="dxa" w:w="3175"/>
+            <w:shd w:val="clear" w:color="auto" w:fill="F2F5FA"/>
+          </w:tcPr>
+          <w:p>
+            <w:pPr>
+              <w:spacing w:after="20" w:line="240" w:lineRule="auto"/>
+            </w:pPr>
+            <w:r>
+              <w:rPr>
+                <w:sz w:val="15"/>
+              </w:rPr>
+              <w:t>Confluent self-managed keys not considered. The mode is fixed at cluster creation, and on Enterprise the Key Vault must allow public access from all networks, which conflicts with step SI-1.</w:t>
+            </w:r>
+          </w:p>
+        </w:tc>
+        <w:tc>
+          <w:tcPr>
+            <w:tcW w:type="dxa" w:w="1928"/>
+            <w:shd w:val="clear" w:color="auto" w:fill="F2F5FA"/>
+          </w:tcPr>
+          <w:p>
+            <w:pPr>
+              <w:spacing w:after="20" w:line="240" w:lineRule="auto"/>
+            </w:pPr>
+            <w:r>
+              <w:rPr>
+                <w:sz w:val="15"/>
+              </w:rPr>
+              <w:t>R73, R74</w:t>
+            </w:r>
+          </w:p>
+        </w:tc>
+        <w:tc>
+          <w:tcPr>
+            <w:tcW w:type="dxa" w:w="2098"/>
+            <w:shd w:val="clear" w:color="auto" w:fill="F2F5FA"/>
+          </w:tcPr>
+          <w:p>
+            <w:pPr>
+              <w:spacing w:after="20" w:line="240" w:lineRule="auto"/>
+            </w:pPr>
+            <w:r>
+              <w:rPr>
+                <w:sz w:val="15"/>
+              </w:rPr>
+              <w:t>Section 9.5; OD-14; DA-3; SI-1 note; known issue</w:t>
+            </w:r>
+          </w:p>
+        </w:tc>
+      </w:tr>
+      <w:tr>
+        <w:trPr>
+          <w:cantSplit w:val="true"/>
+        </w:trPr>
+        <w:tc>
+          <w:tcPr>
+            <w:tcW w:type="dxa" w:w="624"/>
+          </w:tcPr>
+          <w:p>
+            <w:pPr>
+              <w:spacing w:after="20" w:line="240" w:lineRule="auto"/>
+            </w:pPr>
+            <w:r>
+              <w:rPr>
+                <w:sz w:val="15"/>
+              </w:rPr>
+              <w:t>F-29</w:t>
+            </w:r>
+          </w:p>
+        </w:tc>
+        <w:tc>
+          <w:tcPr>
+            <w:tcW w:type="dxa" w:w="680"/>
+          </w:tcPr>
+          <w:p>
+            <w:pPr>
+              <w:spacing w:after="20" w:line="240" w:lineRule="auto"/>
+            </w:pPr>
+            <w:r>
+              <w:rPr>
+                <w:sz w:val="15"/>
+              </w:rPr>
+              <w:t>D15, D6</w:t>
+            </w:r>
+          </w:p>
+        </w:tc>
+        <w:tc>
+          <w:tcPr>
+            <w:tcW w:type="dxa" w:w="907"/>
+          </w:tcPr>
+          <w:p>
+            <w:pPr>
+              <w:spacing w:after="20" w:line="240" w:lineRule="auto"/>
+            </w:pPr>
+            <w:r>
+              <w:rPr>
+                <w:sz w:val="15"/>
+              </w:rPr>
+              <w:t>High</w:t>
+            </w:r>
+          </w:p>
+        </w:tc>
+        <w:tc>
+          <w:tcPr>
+            <w:tcW w:type="dxa" w:w="3175"/>
+          </w:tcPr>
+          <w:p>
+            <w:pPr>
+              <w:spacing w:after="20" w:line="240" w:lineRule="auto"/>
+            </w:pPr>
+            <w:r>
+              <w:rPr>
+                <w:sz w:val="15"/>
+              </w:rPr>
+              <w:t>AKS node storage not covered. Ephemeral OS disks, temp disks and caches are encrypted only with encryption at host, set at node pool creation, and the v2.1 JVM settings write heap dumps there.</w:t>
+            </w:r>
+          </w:p>
+        </w:tc>
+        <w:tc>
+          <w:tcPr>
+            <w:tcW w:type="dxa" w:w="1928"/>
+          </w:tcPr>
+          <w:p>
+            <w:pPr>
+              <w:spacing w:after="20" w:line="240" w:lineRule="auto"/>
+            </w:pPr>
+            <w:r>
+              <w:rPr>
+                <w:sz w:val="15"/>
+              </w:rPr>
+              <w:t>R78, R79</w:t>
+            </w:r>
+          </w:p>
+        </w:tc>
+        <w:tc>
+          <w:tcPr>
+            <w:tcW w:type="dxa" w:w="2098"/>
+          </w:tcPr>
+          <w:p>
+            <w:pPr>
+              <w:spacing w:after="20" w:line="240" w:lineRule="auto"/>
+            </w:pPr>
+            <w:r>
+              <w:rPr>
+                <w:sz w:val="15"/>
+              </w:rPr>
+              <w:t>Section 9.5; OD-18; DA-2; DP-6; Section 4.6 row</w:t>
+            </w:r>
+          </w:p>
+        </w:tc>
+      </w:tr>
+      <w:tr>
+        <w:trPr>
+          <w:cantSplit w:val="true"/>
+        </w:trPr>
+        <w:tc>
+          <w:tcPr>
+            <w:tcW w:type="dxa" w:w="624"/>
+            <w:shd w:val="clear" w:color="auto" w:fill="F2F5FA"/>
+          </w:tcPr>
+          <w:p>
+            <w:pPr>
+              <w:spacing w:after="20" w:line="240" w:lineRule="auto"/>
+            </w:pPr>
+            <w:r>
+              <w:rPr>
+                <w:sz w:val="15"/>
+              </w:rPr>
+              <w:t>F-30</w:t>
+            </w:r>
+          </w:p>
+        </w:tc>
+        <w:tc>
+          <w:tcPr>
+            <w:tcW w:type="dxa" w:w="680"/>
+            <w:shd w:val="clear" w:color="auto" w:fill="F2F5FA"/>
+          </w:tcPr>
+          <w:p>
+            <w:pPr>
+              <w:spacing w:after="20" w:line="240" w:lineRule="auto"/>
+            </w:pPr>
+            <w:r>
+              <w:rPr>
+                <w:sz w:val="15"/>
+              </w:rPr>
+              <w:t>D15</w:t>
+            </w:r>
+          </w:p>
+        </w:tc>
+        <w:tc>
+          <w:tcPr>
+            <w:tcW w:type="dxa" w:w="907"/>
+            <w:shd w:val="clear" w:color="auto" w:fill="F2F5FA"/>
+          </w:tcPr>
+          <w:p>
+            <w:pPr>
+              <w:spacing w:after="20" w:line="240" w:lineRule="auto"/>
+            </w:pPr>
+            <w:r>
+              <w:rPr>
+                <w:sz w:val="15"/>
+              </w:rPr>
+              <w:t>High</w:t>
+            </w:r>
+          </w:p>
+        </w:tc>
+        <w:tc>
+          <w:tcPr>
+            <w:tcW w:type="dxa" w:w="3175"/>
+            <w:shd w:val="clear" w:color="auto" w:fill="F2F5FA"/>
+          </w:tcPr>
+          <w:p>
+            <w:pPr>
+              <w:spacing w:after="20" w:line="240" w:lineRule="auto"/>
+            </w:pPr>
+            <w:r>
+              <w:rPr>
+                <w:sz w:val="15"/>
+              </w:rPr>
+              <w:t>No rules for operational copies: heap dumps hold decrypted values and secrets, broken items hold the payload, slow logs hold search terms, and console consumers copy PROD messages.</w:t>
+            </w:r>
+          </w:p>
+        </w:tc>
+        <w:tc>
+          <w:tcPr>
+            <w:tcW w:type="dxa" w:w="1928"/>
+            <w:shd w:val="clear" w:color="auto" w:fill="F2F5FA"/>
+          </w:tcPr>
+          <w:p>
+            <w:pPr>
+              <w:spacing w:after="20" w:line="240" w:lineRule="auto"/>
+            </w:pPr>
+            <w:r>
+              <w:rPr>
+                <w:sz w:val="15"/>
+              </w:rPr>
+              <w:t>R58, R64</w:t>
+            </w:r>
+          </w:p>
+        </w:tc>
+        <w:tc>
+          <w:tcPr>
+            <w:tcW w:type="dxa" w:w="2098"/>
+            <w:shd w:val="clear" w:color="auto" w:fill="F2F5FA"/>
+          </w:tcPr>
+          <w:p>
+            <w:pPr>
+              <w:spacing w:after="20" w:line="240" w:lineRule="auto"/>
+            </w:pPr>
+            <w:r>
+              <w:rPr>
+                <w:sz w:val="15"/>
+              </w:rPr>
+              <w:t>Section 9.6 rules table; DT-09, DT-10; RK-19</w:t>
+            </w:r>
+          </w:p>
+        </w:tc>
+      </w:tr>
+      <w:tr>
+        <w:trPr>
+          <w:cantSplit w:val="true"/>
+        </w:trPr>
+        <w:tc>
+          <w:tcPr>
+            <w:tcW w:type="dxa" w:w="624"/>
+          </w:tcPr>
+          <w:p>
+            <w:pPr>
+              <w:spacing w:after="20" w:line="240" w:lineRule="auto"/>
+            </w:pPr>
+            <w:r>
+              <w:rPr>
+                <w:sz w:val="15"/>
+              </w:rPr>
+              <w:t>F-31</w:t>
+            </w:r>
+          </w:p>
+        </w:tc>
+        <w:tc>
+          <w:tcPr>
+            <w:tcW w:type="dxa" w:w="680"/>
+          </w:tcPr>
+          <w:p>
+            <w:pPr>
+              <w:spacing w:after="20" w:line="240" w:lineRule="auto"/>
+            </w:pPr>
+            <w:r>
+              <w:rPr>
+                <w:sz w:val="15"/>
+              </w:rPr>
+              <w:t>D15</w:t>
+            </w:r>
+          </w:p>
+        </w:tc>
+        <w:tc>
+          <w:tcPr>
+            <w:tcW w:type="dxa" w:w="907"/>
+          </w:tcPr>
+          <w:p>
+            <w:pPr>
+              <w:spacing w:after="20" w:line="240" w:lineRule="auto"/>
+            </w:pPr>
+            <w:r>
+              <w:rPr>
+                <w:sz w:val="15"/>
+              </w:rPr>
+              <w:t>Medium</w:t>
+            </w:r>
+          </w:p>
+        </w:tc>
+        <w:tc>
+          <w:tcPr>
+            <w:tcW w:type="dxa" w:w="3175"/>
+          </w:tcPr>
+          <w:p>
+            <w:pPr>
+              <w:spacing w:after="20" w:line="240" w:lineRule="auto"/>
+            </w:pPr>
+            <w:r>
+              <w:rPr>
+                <w:sz w:val="15"/>
+              </w:rPr>
+              <w:t>Retention and erasure missing. Confluent keeps messages 7 days by default and cannot delete a single record; Pega's removal of index documents on purge is not documented; snapshots keep erased data.</w:t>
+            </w:r>
+          </w:p>
+        </w:tc>
+        <w:tc>
+          <w:tcPr>
+            <w:tcW w:type="dxa" w:w="1928"/>
+          </w:tcPr>
+          <w:p>
+            <w:pPr>
+              <w:spacing w:after="20" w:line="240" w:lineRule="auto"/>
+            </w:pPr>
+            <w:r>
+              <w:rPr>
+                <w:sz w:val="15"/>
+              </w:rPr>
+              <w:t>R33; Pega pages silent</w:t>
+            </w:r>
+          </w:p>
+        </w:tc>
+        <w:tc>
+          <w:tcPr>
+            <w:tcW w:type="dxa" w:w="2098"/>
+          </w:tcPr>
+          <w:p>
+            <w:pPr>
+              <w:spacing w:after="20" w:line="240" w:lineRule="auto"/>
+            </w:pPr>
+            <w:r>
+              <w:rPr>
+                <w:sz w:val="15"/>
+              </w:rPr>
+              <w:t>Section 9.7; OD-16, OD-17; GQ-11; DT-05, DT-06</w:t>
+            </w:r>
+          </w:p>
+        </w:tc>
+      </w:tr>
+      <w:tr>
+        <w:trPr>
+          <w:cantSplit w:val="true"/>
+        </w:trPr>
+        <w:tc>
+          <w:tcPr>
+            <w:tcW w:type="dxa" w:w="624"/>
+            <w:shd w:val="clear" w:color="auto" w:fill="F2F5FA"/>
+          </w:tcPr>
+          <w:p>
+            <w:pPr>
+              <w:spacing w:after="20" w:line="240" w:lineRule="auto"/>
+            </w:pPr>
+            <w:r>
+              <w:rPr>
+                <w:sz w:val="15"/>
+              </w:rPr>
+              <w:t>F-32</w:t>
+            </w:r>
+          </w:p>
+        </w:tc>
+        <w:tc>
+          <w:tcPr>
+            <w:tcW w:type="dxa" w:w="680"/>
+            <w:shd w:val="clear" w:color="auto" w:fill="F2F5FA"/>
+          </w:tcPr>
+          <w:p>
+            <w:pPr>
+              <w:spacing w:after="20" w:line="240" w:lineRule="auto"/>
+            </w:pPr>
+            <w:r>
+              <w:rPr>
+                <w:sz w:val="15"/>
+              </w:rPr>
+              <w:t>D7, D15</w:t>
+            </w:r>
+          </w:p>
+        </w:tc>
+        <w:tc>
+          <w:tcPr>
+            <w:tcW w:type="dxa" w:w="907"/>
+            <w:shd w:val="clear" w:color="auto" w:fill="F2F5FA"/>
+          </w:tcPr>
+          <w:p>
+            <w:pPr>
+              <w:spacing w:after="20" w:line="240" w:lineRule="auto"/>
+            </w:pPr>
+            <w:r>
+              <w:rPr>
+                <w:sz w:val="15"/>
+              </w:rPr>
+              <w:t>Medium</w:t>
+            </w:r>
+          </w:p>
+        </w:tc>
+        <w:tc>
+          <w:tcPr>
+            <w:tcW w:type="dxa" w:w="3175"/>
+            <w:shd w:val="clear" w:color="auto" w:fill="F2F5FA"/>
+          </w:tcPr>
+          <w:p>
+            <w:pPr>
+              <w:spacing w:after="20" w:line="240" w:lineRule="auto"/>
+            </w:pPr>
+            <w:r>
+              <w:rPr>
+                <w:sz w:val="15"/>
+              </w:rPr>
+              <w:t xml:space="preserve">Data behaviour under failure not described: database fallback when Kafka is down, broken queue, repeat delivery, 100-item bulk failure, fields skipped by </w:t>
+            </w:r>
+            <w:r>
+              <w:rPr>
+                <w:rFonts w:ascii="Consolas" w:hAnsi="Consolas"/>
+                <w:color w:val="1F3864"/>
+                <w:sz w:val="15"/>
+              </w:rPr>
+              <w:t>failOnUnrecognisedValue</w:t>
+            </w:r>
+            <w:r>
+              <w:rPr>
+                <w:sz w:val="15"/>
+              </w:rPr>
+              <w:t>, and loss when lag exceeds retention.</w:t>
+            </w:r>
+          </w:p>
+        </w:tc>
+        <w:tc>
+          <w:tcPr>
+            <w:tcW w:type="dxa" w:w="1928"/>
+            <w:shd w:val="clear" w:color="auto" w:fill="F2F5FA"/>
+          </w:tcPr>
+          <w:p>
+            <w:pPr>
+              <w:spacing w:after="20" w:line="240" w:lineRule="auto"/>
+            </w:pPr>
+            <w:r>
+              <w:rPr>
+                <w:sz w:val="15"/>
+              </w:rPr>
+              <w:t>R33, R64, R66, R69, R70</w:t>
+            </w:r>
+          </w:p>
+        </w:tc>
+        <w:tc>
+          <w:tcPr>
+            <w:tcW w:type="dxa" w:w="2098"/>
+            <w:shd w:val="clear" w:color="auto" w:fill="F2F5FA"/>
+          </w:tcPr>
+          <w:p>
+            <w:pPr>
+              <w:spacing w:after="20" w:line="240" w:lineRule="auto"/>
+            </w:pPr>
+            <w:r>
+              <w:rPr>
+                <w:sz w:val="15"/>
+              </w:rPr>
+              <w:t>Section 9.8 with figure and DF-01 to DF-11; three new alerts; RK-21</w:t>
+            </w:r>
+          </w:p>
+        </w:tc>
+      </w:tr>
+      <w:tr>
+        <w:trPr>
+          <w:cantSplit w:val="true"/>
+        </w:trPr>
+        <w:tc>
+          <w:tcPr>
+            <w:tcW w:type="dxa" w:w="624"/>
+          </w:tcPr>
+          <w:p>
+            <w:pPr>
+              <w:spacing w:after="20" w:line="240" w:lineRule="auto"/>
+            </w:pPr>
+            <w:r>
+              <w:rPr>
+                <w:sz w:val="15"/>
+              </w:rPr>
+              <w:t>F-33</w:t>
+            </w:r>
+          </w:p>
+        </w:tc>
+        <w:tc>
+          <w:tcPr>
+            <w:tcW w:type="dxa" w:w="680"/>
+          </w:tcPr>
+          <w:p>
+            <w:pPr>
+              <w:spacing w:after="20" w:line="240" w:lineRule="auto"/>
+            </w:pPr>
+            <w:r>
+              <w:rPr>
+                <w:sz w:val="15"/>
+              </w:rPr>
+              <w:t>D3, D15</w:t>
+            </w:r>
+          </w:p>
+        </w:tc>
+        <w:tc>
+          <w:tcPr>
+            <w:tcW w:type="dxa" w:w="907"/>
+          </w:tcPr>
+          <w:p>
+            <w:pPr>
+              <w:spacing w:after="20" w:line="240" w:lineRule="auto"/>
+            </w:pPr>
+            <w:r>
+              <w:rPr>
+                <w:sz w:val="15"/>
+              </w:rPr>
+              <w:t>Medium</w:t>
+            </w:r>
+          </w:p>
+        </w:tc>
+        <w:tc>
+          <w:tcPr>
+            <w:tcW w:type="dxa" w:w="3175"/>
+          </w:tcPr>
+          <w:p>
+            <w:pPr>
+              <w:spacing w:after="20" w:line="240" w:lineRule="auto"/>
+            </w:pPr>
+            <w:r>
+              <w:rPr>
+                <w:sz w:val="15"/>
+              </w:rPr>
+              <w:t>Provider criteria lacked encryption at rest, HTTPS-only REST, node-to-node TLS and audit logging. OpenSearch allows plain HTTP on the REST layer.</w:t>
+            </w:r>
+          </w:p>
+        </w:tc>
+        <w:tc>
+          <w:tcPr>
+            <w:tcW w:type="dxa" w:w="1928"/>
+          </w:tcPr>
+          <w:p>
+            <w:pPr>
+              <w:spacing w:after="20" w:line="240" w:lineRule="auto"/>
+            </w:pPr>
+            <w:r>
+              <w:rPr>
+                <w:sz w:val="15"/>
+              </w:rPr>
+              <w:t>R76, R77</w:t>
+            </w:r>
+          </w:p>
+        </w:tc>
+        <w:tc>
+          <w:tcPr>
+            <w:tcW w:type="dxa" w:w="2098"/>
+          </w:tcPr>
+          <w:p>
+            <w:pPr>
+              <w:spacing w:after="20" w:line="240" w:lineRule="auto"/>
+            </w:pPr>
+            <w:r>
+              <w:rPr>
+                <w:sz w:val="15"/>
+              </w:rPr>
+              <w:t>Three rows added to the provider worksheet (Section 7.3); AS-12</w:t>
+            </w:r>
+          </w:p>
+        </w:tc>
+      </w:tr>
+      <w:tr>
+        <w:trPr>
+          <w:cantSplit w:val="true"/>
+        </w:trPr>
+        <w:tc>
+          <w:tcPr>
+            <w:tcW w:type="dxa" w:w="624"/>
+            <w:shd w:val="clear" w:color="auto" w:fill="F2F5FA"/>
+          </w:tcPr>
+          <w:p>
+            <w:pPr>
+              <w:spacing w:after="20" w:line="240" w:lineRule="auto"/>
+            </w:pPr>
+            <w:r>
+              <w:rPr>
+                <w:sz w:val="15"/>
+              </w:rPr>
+              <w:t>F-34</w:t>
+            </w:r>
+          </w:p>
+        </w:tc>
+        <w:tc>
+          <w:tcPr>
+            <w:tcW w:type="dxa" w:w="680"/>
+            <w:shd w:val="clear" w:color="auto" w:fill="F2F5FA"/>
+          </w:tcPr>
+          <w:p>
+            <w:pPr>
+              <w:spacing w:after="20" w:line="240" w:lineRule="auto"/>
+            </w:pPr>
+            <w:r>
+              <w:rPr>
+                <w:sz w:val="15"/>
+              </w:rPr>
+              <w:t>D8, D15</w:t>
+            </w:r>
+          </w:p>
+        </w:tc>
+        <w:tc>
+          <w:tcPr>
+            <w:tcW w:type="dxa" w:w="907"/>
+            <w:shd w:val="clear" w:color="auto" w:fill="F2F5FA"/>
+          </w:tcPr>
+          <w:p>
+            <w:pPr>
+              <w:spacing w:after="20" w:line="240" w:lineRule="auto"/>
+            </w:pPr>
+            <w:r>
+              <w:rPr>
+                <w:sz w:val="15"/>
+              </w:rPr>
+              <w:t>Medium</w:t>
+            </w:r>
+          </w:p>
+        </w:tc>
+        <w:tc>
+          <w:tcPr>
+            <w:tcW w:type="dxa" w:w="3175"/>
+            <w:shd w:val="clear" w:color="auto" w:fill="F2F5FA"/>
+          </w:tcPr>
+          <w:p>
+            <w:pPr>
+              <w:spacing w:after="20" w:line="240" w:lineRule="auto"/>
+            </w:pPr>
+            <w:r>
+              <w:rPr>
+                <w:sz w:val="15"/>
+              </w:rPr>
+              <w:t>No data tests and no data evidence in the acceptance criteria.</w:t>
+            </w:r>
+          </w:p>
+        </w:tc>
+        <w:tc>
+          <w:tcPr>
+            <w:tcW w:type="dxa" w:w="1928"/>
+            <w:shd w:val="clear" w:color="auto" w:fill="F2F5FA"/>
+          </w:tcPr>
+          <w:p>
+            <w:pPr>
+              <w:spacing w:after="20" w:line="240" w:lineRule="auto"/>
+            </w:pPr>
+            <w:r>
+              <w:rPr>
+                <w:sz w:val="15"/>
+              </w:rPr>
+              <w:t>v2.1 Section 14</w:t>
+            </w:r>
+          </w:p>
+        </w:tc>
+        <w:tc>
+          <w:tcPr>
+            <w:tcW w:type="dxa" w:w="2098"/>
+            <w:shd w:val="clear" w:color="auto" w:fill="F2F5FA"/>
+          </w:tcPr>
+          <w:p>
+            <w:pPr>
+              <w:spacing w:after="20" w:line="240" w:lineRule="auto"/>
+            </w:pPr>
+            <w:r>
+              <w:rPr>
+                <w:sz w:val="15"/>
+              </w:rPr>
+              <w:t>DT-01 to DT-12 with commands DP-1 to DP-6; AC-7; evidence item E-11; DA steps</w:t>
+            </w:r>
+          </w:p>
+        </w:tc>
+      </w:tr>
+      <w:tr>
+        <w:trPr>
+          <w:cantSplit w:val="true"/>
+        </w:trPr>
+        <w:tc>
+          <w:tcPr>
+            <w:tcW w:type="dxa" w:w="624"/>
+          </w:tcPr>
+          <w:p>
+            <w:pPr>
+              <w:spacing w:after="20" w:line="240" w:lineRule="auto"/>
+            </w:pPr>
+            <w:r>
+              <w:rPr>
+                <w:sz w:val="15"/>
+              </w:rPr>
+              <w:t>F-35</w:t>
+            </w:r>
+          </w:p>
+        </w:tc>
+        <w:tc>
+          <w:tcPr>
+            <w:tcW w:type="dxa" w:w="680"/>
+          </w:tcPr>
+          <w:p>
+            <w:pPr>
+              <w:spacing w:after="20" w:line="240" w:lineRule="auto"/>
+            </w:pPr>
+            <w:r>
+              <w:rPr>
+                <w:sz w:val="15"/>
+              </w:rPr>
+              <w:t>D2</w:t>
+            </w:r>
+          </w:p>
+        </w:tc>
+        <w:tc>
+          <w:tcPr>
+            <w:tcW w:type="dxa" w:w="907"/>
+          </w:tcPr>
+          <w:p>
+            <w:pPr>
+              <w:spacing w:after="20" w:line="240" w:lineRule="auto"/>
+            </w:pPr>
+            <w:r>
+              <w:rPr>
+                <w:sz w:val="15"/>
+              </w:rPr>
+              <w:t>Low</w:t>
+            </w:r>
+          </w:p>
+        </w:tc>
+        <w:tc>
+          <w:tcPr>
+            <w:tcW w:type="dxa" w:w="3175"/>
+          </w:tcPr>
+          <w:p>
+            <w:pPr>
+              <w:spacing w:after="20" w:line="240" w:lineRule="auto"/>
+            </w:pPr>
+            <w:r>
+              <w:rPr>
+                <w:sz w:val="15"/>
+              </w:rPr>
+              <w:t>TLS versions on Confluent not stated: TLS 1.3 preferred with TLS 1.2 fallback, and Dedicated clusters created before 30 April 2026 need TLS 1.3 enabled.</w:t>
+            </w:r>
+          </w:p>
+        </w:tc>
+        <w:tc>
+          <w:tcPr>
+            <w:tcW w:type="dxa" w:w="1928"/>
+          </w:tcPr>
+          <w:p>
+            <w:pPr>
+              <w:spacing w:after="20" w:line="240" w:lineRule="auto"/>
+            </w:pPr>
+            <w:r>
+              <w:rPr>
+                <w:sz w:val="15"/>
+              </w:rPr>
+              <w:t>R75</w:t>
+            </w:r>
+          </w:p>
+        </w:tc>
+        <w:tc>
+          <w:tcPr>
+            <w:tcW w:type="dxa" w:w="2098"/>
+          </w:tcPr>
+          <w:p>
+            <w:pPr>
+              <w:spacing w:after="20" w:line="240" w:lineRule="auto"/>
+            </w:pPr>
+            <w:r>
+              <w:rPr>
+                <w:sz w:val="15"/>
+              </w:rPr>
+              <w:t>Section 9.4</w:t>
             </w:r>
           </w:p>
         </w:tc>
@@ -5347,7 +6595,7 @@
         <w:spacing w:before="80"/>
       </w:pPr>
       <w:r>
-        <w:t>Table 5. Scorecard before and after the corrections</w:t>
+        <w:t>Table 5. Scorecard by version</w:t>
       </w:r>
     </w:p>
     <w:tbl>
@@ -5375,9 +6623,10 @@
       <w:tblGrid>
         <w:gridCol w:w="623"/>
         <w:gridCol w:w="2608"/>
-        <w:gridCol w:w="1134"/>
-        <w:gridCol w:w="1134"/>
-        <w:gridCol w:w="3912"/>
+        <w:gridCol w:w="737"/>
+        <w:gridCol w:w="737"/>
+        <w:gridCol w:w="737"/>
+        <w:gridCol w:w="3969"/>
       </w:tblGrid>
       <w:tr>
         <w:trPr>
@@ -5424,7 +6673,7 @@
         </w:tc>
         <w:tc>
           <w:tcPr>
-            <w:tcW w:type="dxa" w:w="1134"/>
+            <w:tcW w:type="dxa" w:w="737"/>
             <w:shd w:val="clear" w:color="auto" w:fill="1F3864"/>
           </w:tcPr>
           <w:p>
@@ -5437,13 +6686,13 @@
                 <w:color w:val="FFFFFF"/>
                 <w:sz w:val="17"/>
               </w:rPr>
-              <w:t>Version 2.0</w:t>
-            </w:r>
-          </w:p>
-        </w:tc>
-        <w:tc>
-          <w:tcPr>
-            <w:tcW w:type="dxa" w:w="1134"/>
+              <w:t>2.0</w:t>
+            </w:r>
+          </w:p>
+        </w:tc>
+        <w:tc>
+          <w:tcPr>
+            <w:tcW w:type="dxa" w:w="737"/>
             <w:shd w:val="clear" w:color="auto" w:fill="1F3864"/>
           </w:tcPr>
           <w:p>
@@ -5456,13 +6705,32 @@
                 <w:color w:val="FFFFFF"/>
                 <w:sz w:val="17"/>
               </w:rPr>
-              <w:t>Version 2.1</w:t>
-            </w:r>
-          </w:p>
-        </w:tc>
-        <w:tc>
-          <w:tcPr>
-            <w:tcW w:type="dxa" w:w="3912"/>
+              <w:t>2.1</w:t>
+            </w:r>
+          </w:p>
+        </w:tc>
+        <w:tc>
+          <w:tcPr>
+            <w:tcW w:type="dxa" w:w="737"/>
+            <w:shd w:val="clear" w:color="auto" w:fill="1F3864"/>
+          </w:tcPr>
+          <w:p>
+            <w:pPr>
+              <w:spacing w:after="0"/>
+            </w:pPr>
+            <w:r>
+              <w:rPr>
+                <w:b/>
+                <w:color w:val="FFFFFF"/>
+                <w:sz w:val="17"/>
+              </w:rPr>
+              <w:t>2.2</w:t>
+            </w:r>
+          </w:p>
+        </w:tc>
+        <w:tc>
+          <w:tcPr>
+            <w:tcW w:type="dxa" w:w="3969"/>
             <w:shd w:val="clear" w:color="auto" w:fill="1F3864"/>
           </w:tcPr>
           <w:p>
@@ -5518,7 +6786,7 @@
         </w:tc>
         <w:tc>
           <w:tcPr>
-            <w:tcW w:type="dxa" w:w="1134"/>
+            <w:tcW w:type="dxa" w:w="737"/>
           </w:tcPr>
           <w:p>
             <w:pPr>
@@ -5534,7 +6802,7 @@
         </w:tc>
         <w:tc>
           <w:tcPr>
-            <w:tcW w:type="dxa" w:w="1134"/>
+            <w:tcW w:type="dxa" w:w="737"/>
           </w:tcPr>
           <w:p>
             <w:pPr>
@@ -5550,7 +6818,23 @@
         </w:tc>
         <w:tc>
           <w:tcPr>
-            <w:tcW w:type="dxa" w:w="3912"/>
+            <w:tcW w:type="dxa" w:w="737"/>
+          </w:tcPr>
+          <w:p>
+            <w:pPr>
+              <w:spacing w:after="20" w:line="240" w:lineRule="auto"/>
+            </w:pPr>
+            <w:r>
+              <w:rPr>
+                <w:sz w:val="17"/>
+              </w:rPr>
+              <w:t>5</w:t>
+            </w:r>
+          </w:p>
+        </w:tc>
+        <w:tc>
+          <w:tcPr>
+            <w:tcW w:type="dxa" w:w="3969"/>
           </w:tcPr>
           <w:p>
             <w:pPr>
@@ -5605,7 +6889,7 @@
         </w:tc>
         <w:tc>
           <w:tcPr>
-            <w:tcW w:type="dxa" w:w="1134"/>
+            <w:tcW w:type="dxa" w:w="737"/>
             <w:shd w:val="clear" w:color="auto" w:fill="F2F5FA"/>
           </w:tcPr>
           <w:p>
@@ -5622,7 +6906,7 @@
         </w:tc>
         <w:tc>
           <w:tcPr>
-            <w:tcW w:type="dxa" w:w="1134"/>
+            <w:tcW w:type="dxa" w:w="737"/>
             <w:shd w:val="clear" w:color="auto" w:fill="F2F5FA"/>
           </w:tcPr>
           <w:p>
@@ -5639,7 +6923,24 @@
         </w:tc>
         <w:tc>
           <w:tcPr>
-            <w:tcW w:type="dxa" w:w="3912"/>
+            <w:tcW w:type="dxa" w:w="737"/>
+            <w:shd w:val="clear" w:color="auto" w:fill="F2F5FA"/>
+          </w:tcPr>
+          <w:p>
+            <w:pPr>
+              <w:spacing w:after="20" w:line="240" w:lineRule="auto"/>
+            </w:pPr>
+            <w:r>
+              <w:rPr>
+                <w:sz w:val="17"/>
+              </w:rPr>
+              <w:t>5</w:t>
+            </w:r>
+          </w:p>
+        </w:tc>
+        <w:tc>
+          <w:tcPr>
+            <w:tcW w:type="dxa" w:w="3969"/>
             <w:shd w:val="clear" w:color="auto" w:fill="F2F5FA"/>
           </w:tcPr>
           <w:p>
@@ -5693,7 +6994,7 @@
         </w:tc>
         <w:tc>
           <w:tcPr>
-            <w:tcW w:type="dxa" w:w="1134"/>
+            <w:tcW w:type="dxa" w:w="737"/>
           </w:tcPr>
           <w:p>
             <w:pPr>
@@ -5709,7 +7010,7 @@
         </w:tc>
         <w:tc>
           <w:tcPr>
-            <w:tcW w:type="dxa" w:w="1134"/>
+            <w:tcW w:type="dxa" w:w="737"/>
           </w:tcPr>
           <w:p>
             <w:pPr>
@@ -5725,7 +7026,23 @@
         </w:tc>
         <w:tc>
           <w:tcPr>
-            <w:tcW w:type="dxa" w:w="3912"/>
+            <w:tcW w:type="dxa" w:w="737"/>
+          </w:tcPr>
+          <w:p>
+            <w:pPr>
+              <w:spacing w:after="20" w:line="240" w:lineRule="auto"/>
+            </w:pPr>
+            <w:r>
+              <w:rPr>
+                <w:sz w:val="17"/>
+              </w:rPr>
+              <w:t>5</w:t>
+            </w:r>
+          </w:p>
+        </w:tc>
+        <w:tc>
+          <w:tcPr>
+            <w:tcW w:type="dxa" w:w="3969"/>
           </w:tcPr>
           <w:p>
             <w:pPr>
@@ -5780,7 +7097,7 @@
         </w:tc>
         <w:tc>
           <w:tcPr>
-            <w:tcW w:type="dxa" w:w="1134"/>
+            <w:tcW w:type="dxa" w:w="737"/>
             <w:shd w:val="clear" w:color="auto" w:fill="F2F5FA"/>
           </w:tcPr>
           <w:p>
@@ -5797,7 +7114,7 @@
         </w:tc>
         <w:tc>
           <w:tcPr>
-            <w:tcW w:type="dxa" w:w="1134"/>
+            <w:tcW w:type="dxa" w:w="737"/>
             <w:shd w:val="clear" w:color="auto" w:fill="F2F5FA"/>
           </w:tcPr>
           <w:p>
@@ -5814,7 +7131,24 @@
         </w:tc>
         <w:tc>
           <w:tcPr>
-            <w:tcW w:type="dxa" w:w="3912"/>
+            <w:tcW w:type="dxa" w:w="737"/>
+            <w:shd w:val="clear" w:color="auto" w:fill="F2F5FA"/>
+          </w:tcPr>
+          <w:p>
+            <w:pPr>
+              <w:spacing w:after="20" w:line="240" w:lineRule="auto"/>
+            </w:pPr>
+            <w:r>
+              <w:rPr>
+                <w:sz w:val="17"/>
+              </w:rPr>
+              <w:t>5</w:t>
+            </w:r>
+          </w:p>
+        </w:tc>
+        <w:tc>
+          <w:tcPr>
+            <w:tcW w:type="dxa" w:w="3969"/>
             <w:shd w:val="clear" w:color="auto" w:fill="F2F5FA"/>
           </w:tcPr>
           <w:p>
@@ -5868,7 +7202,7 @@
         </w:tc>
         <w:tc>
           <w:tcPr>
-            <w:tcW w:type="dxa" w:w="1134"/>
+            <w:tcW w:type="dxa" w:w="737"/>
           </w:tcPr>
           <w:p>
             <w:pPr>
@@ -5884,7 +7218,7 @@
         </w:tc>
         <w:tc>
           <w:tcPr>
-            <w:tcW w:type="dxa" w:w="1134"/>
+            <w:tcW w:type="dxa" w:w="737"/>
           </w:tcPr>
           <w:p>
             <w:pPr>
@@ -5900,7 +7234,23 @@
         </w:tc>
         <w:tc>
           <w:tcPr>
-            <w:tcW w:type="dxa" w:w="3912"/>
+            <w:tcW w:type="dxa" w:w="737"/>
+          </w:tcPr>
+          <w:p>
+            <w:pPr>
+              <w:spacing w:after="20" w:line="240" w:lineRule="auto"/>
+            </w:pPr>
+            <w:r>
+              <w:rPr>
+                <w:sz w:val="17"/>
+              </w:rPr>
+              <w:t>5</w:t>
+            </w:r>
+          </w:p>
+        </w:tc>
+        <w:tc>
+          <w:tcPr>
+            <w:tcW w:type="dxa" w:w="3969"/>
           </w:tcPr>
           <w:p>
             <w:pPr>
@@ -5955,7 +7305,7 @@
         </w:tc>
         <w:tc>
           <w:tcPr>
-            <w:tcW w:type="dxa" w:w="1134"/>
+            <w:tcW w:type="dxa" w:w="737"/>
             <w:shd w:val="clear" w:color="auto" w:fill="F2F5FA"/>
           </w:tcPr>
           <w:p>
@@ -5972,7 +7322,7 @@
         </w:tc>
         <w:tc>
           <w:tcPr>
-            <w:tcW w:type="dxa" w:w="1134"/>
+            <w:tcW w:type="dxa" w:w="737"/>
             <w:shd w:val="clear" w:color="auto" w:fill="F2F5FA"/>
           </w:tcPr>
           <w:p>
@@ -5989,7 +7339,24 @@
         </w:tc>
         <w:tc>
           <w:tcPr>
-            <w:tcW w:type="dxa" w:w="3912"/>
+            <w:tcW w:type="dxa" w:w="737"/>
+            <w:shd w:val="clear" w:color="auto" w:fill="F2F5FA"/>
+          </w:tcPr>
+          <w:p>
+            <w:pPr>
+              <w:spacing w:after="20" w:line="240" w:lineRule="auto"/>
+            </w:pPr>
+            <w:r>
+              <w:rPr>
+                <w:sz w:val="17"/>
+              </w:rPr>
+              <w:t>4</w:t>
+            </w:r>
+          </w:p>
+        </w:tc>
+        <w:tc>
+          <w:tcPr>
+            <w:tcW w:type="dxa" w:w="3969"/>
             <w:shd w:val="clear" w:color="auto" w:fill="F2F5FA"/>
           </w:tcPr>
           <w:p>
@@ -6043,7 +7410,7 @@
         </w:tc>
         <w:tc>
           <w:tcPr>
-            <w:tcW w:type="dxa" w:w="1134"/>
+            <w:tcW w:type="dxa" w:w="737"/>
           </w:tcPr>
           <w:p>
             <w:pPr>
@@ -6059,7 +7426,7 @@
         </w:tc>
         <w:tc>
           <w:tcPr>
-            <w:tcW w:type="dxa" w:w="1134"/>
+            <w:tcW w:type="dxa" w:w="737"/>
           </w:tcPr>
           <w:p>
             <w:pPr>
@@ -6069,13 +7436,29 @@
               <w:rPr>
                 <w:sz w:val="17"/>
               </w:rPr>
+              <w:t>4</w:t>
+            </w:r>
+          </w:p>
+        </w:tc>
+        <w:tc>
+          <w:tcPr>
+            <w:tcW w:type="dxa" w:w="737"/>
+          </w:tcPr>
+          <w:p>
+            <w:pPr>
+              <w:spacing w:after="20" w:line="240" w:lineRule="auto"/>
+            </w:pPr>
+            <w:r>
+              <w:rPr>
+                <w:sz w:val="17"/>
+              </w:rPr>
               <w:t>5</w:t>
             </w:r>
           </w:p>
         </w:tc>
         <w:tc>
           <w:tcPr>
-            <w:tcW w:type="dxa" w:w="3912"/>
+            <w:tcW w:type="dxa" w:w="3969"/>
           </w:tcPr>
           <w:p>
             <w:pPr>
@@ -6130,7 +7513,7 @@
         </w:tc>
         <w:tc>
           <w:tcPr>
-            <w:tcW w:type="dxa" w:w="1134"/>
+            <w:tcW w:type="dxa" w:w="737"/>
             <w:shd w:val="clear" w:color="auto" w:fill="F2F5FA"/>
           </w:tcPr>
           <w:p>
@@ -6147,7 +7530,7 @@
         </w:tc>
         <w:tc>
           <w:tcPr>
-            <w:tcW w:type="dxa" w:w="1134"/>
+            <w:tcW w:type="dxa" w:w="737"/>
             <w:shd w:val="clear" w:color="auto" w:fill="F2F5FA"/>
           </w:tcPr>
           <w:p>
@@ -6164,7 +7547,24 @@
         </w:tc>
         <w:tc>
           <w:tcPr>
-            <w:tcW w:type="dxa" w:w="3912"/>
+            <w:tcW w:type="dxa" w:w="737"/>
+            <w:shd w:val="clear" w:color="auto" w:fill="F2F5FA"/>
+          </w:tcPr>
+          <w:p>
+            <w:pPr>
+              <w:spacing w:after="20" w:line="240" w:lineRule="auto"/>
+            </w:pPr>
+            <w:r>
+              <w:rPr>
+                <w:sz w:val="17"/>
+              </w:rPr>
+              <w:t>4</w:t>
+            </w:r>
+          </w:p>
+        </w:tc>
+        <w:tc>
+          <w:tcPr>
+            <w:tcW w:type="dxa" w:w="3969"/>
             <w:shd w:val="clear" w:color="auto" w:fill="F2F5FA"/>
           </w:tcPr>
           <w:p>
@@ -6218,7 +7618,7 @@
         </w:tc>
         <w:tc>
           <w:tcPr>
-            <w:tcW w:type="dxa" w:w="1134"/>
+            <w:tcW w:type="dxa" w:w="737"/>
           </w:tcPr>
           <w:p>
             <w:pPr>
@@ -6234,7 +7634,7 @@
         </w:tc>
         <w:tc>
           <w:tcPr>
-            <w:tcW w:type="dxa" w:w="1134"/>
+            <w:tcW w:type="dxa" w:w="737"/>
           </w:tcPr>
           <w:p>
             <w:pPr>
@@ -6250,7 +7650,23 @@
         </w:tc>
         <w:tc>
           <w:tcPr>
-            <w:tcW w:type="dxa" w:w="3912"/>
+            <w:tcW w:type="dxa" w:w="737"/>
+          </w:tcPr>
+          <w:p>
+            <w:pPr>
+              <w:spacing w:after="20" w:line="240" w:lineRule="auto"/>
+            </w:pPr>
+            <w:r>
+              <w:rPr>
+                <w:sz w:val="17"/>
+              </w:rPr>
+              <w:t>4</w:t>
+            </w:r>
+          </w:p>
+        </w:tc>
+        <w:tc>
+          <w:tcPr>
+            <w:tcW w:type="dxa" w:w="3969"/>
           </w:tcPr>
           <w:p>
             <w:pPr>
@@ -6305,7 +7721,7 @@
         </w:tc>
         <w:tc>
           <w:tcPr>
-            <w:tcW w:type="dxa" w:w="1134"/>
+            <w:tcW w:type="dxa" w:w="737"/>
             <w:shd w:val="clear" w:color="auto" w:fill="F2F5FA"/>
           </w:tcPr>
           <w:p>
@@ -6322,7 +7738,7 @@
         </w:tc>
         <w:tc>
           <w:tcPr>
-            <w:tcW w:type="dxa" w:w="1134"/>
+            <w:tcW w:type="dxa" w:w="737"/>
             <w:shd w:val="clear" w:color="auto" w:fill="F2F5FA"/>
           </w:tcPr>
           <w:p>
@@ -6339,7 +7755,24 @@
         </w:tc>
         <w:tc>
           <w:tcPr>
-            <w:tcW w:type="dxa" w:w="3912"/>
+            <w:tcW w:type="dxa" w:w="737"/>
+            <w:shd w:val="clear" w:color="auto" w:fill="F2F5FA"/>
+          </w:tcPr>
+          <w:p>
+            <w:pPr>
+              <w:spacing w:after="20" w:line="240" w:lineRule="auto"/>
+            </w:pPr>
+            <w:r>
+              <w:rPr>
+                <w:sz w:val="17"/>
+              </w:rPr>
+              <w:t>4</w:t>
+            </w:r>
+          </w:p>
+        </w:tc>
+        <w:tc>
+          <w:tcPr>
+            <w:tcW w:type="dxa" w:w="3969"/>
             <w:shd w:val="clear" w:color="auto" w:fill="F2F5FA"/>
           </w:tcPr>
           <w:p>
@@ -6393,7 +7826,7 @@
         </w:tc>
         <w:tc>
           <w:tcPr>
-            <w:tcW w:type="dxa" w:w="1134"/>
+            <w:tcW w:type="dxa" w:w="737"/>
           </w:tcPr>
           <w:p>
             <w:pPr>
@@ -6409,7 +7842,7 @@
         </w:tc>
         <w:tc>
           <w:tcPr>
-            <w:tcW w:type="dxa" w:w="1134"/>
+            <w:tcW w:type="dxa" w:w="737"/>
           </w:tcPr>
           <w:p>
             <w:pPr>
@@ -6425,7 +7858,23 @@
         </w:tc>
         <w:tc>
           <w:tcPr>
-            <w:tcW w:type="dxa" w:w="3912"/>
+            <w:tcW w:type="dxa" w:w="737"/>
+          </w:tcPr>
+          <w:p>
+            <w:pPr>
+              <w:spacing w:after="20" w:line="240" w:lineRule="auto"/>
+            </w:pPr>
+            <w:r>
+              <w:rPr>
+                <w:sz w:val="17"/>
+              </w:rPr>
+              <w:t>4</w:t>
+            </w:r>
+          </w:p>
+        </w:tc>
+        <w:tc>
+          <w:tcPr>
+            <w:tcW w:type="dxa" w:w="3969"/>
           </w:tcPr>
           <w:p>
             <w:pPr>
@@ -6480,7 +7929,7 @@
         </w:tc>
         <w:tc>
           <w:tcPr>
-            <w:tcW w:type="dxa" w:w="1134"/>
+            <w:tcW w:type="dxa" w:w="737"/>
             <w:shd w:val="clear" w:color="auto" w:fill="F2F5FA"/>
           </w:tcPr>
           <w:p>
@@ -6497,7 +7946,7 @@
         </w:tc>
         <w:tc>
           <w:tcPr>
-            <w:tcW w:type="dxa" w:w="1134"/>
+            <w:tcW w:type="dxa" w:w="737"/>
             <w:shd w:val="clear" w:color="auto" w:fill="F2F5FA"/>
           </w:tcPr>
           <w:p>
@@ -6514,7 +7963,24 @@
         </w:tc>
         <w:tc>
           <w:tcPr>
-            <w:tcW w:type="dxa" w:w="3912"/>
+            <w:tcW w:type="dxa" w:w="737"/>
+            <w:shd w:val="clear" w:color="auto" w:fill="F2F5FA"/>
+          </w:tcPr>
+          <w:p>
+            <w:pPr>
+              <w:spacing w:after="20" w:line="240" w:lineRule="auto"/>
+            </w:pPr>
+            <w:r>
+              <w:rPr>
+                <w:sz w:val="17"/>
+              </w:rPr>
+              <w:t>4</w:t>
+            </w:r>
+          </w:p>
+        </w:tc>
+        <w:tc>
+          <w:tcPr>
+            <w:tcW w:type="dxa" w:w="3969"/>
             <w:shd w:val="clear" w:color="auto" w:fill="F2F5FA"/>
           </w:tcPr>
           <w:p>
@@ -6568,7 +8034,7 @@
         </w:tc>
         <w:tc>
           <w:tcPr>
-            <w:tcW w:type="dxa" w:w="1134"/>
+            <w:tcW w:type="dxa" w:w="737"/>
           </w:tcPr>
           <w:p>
             <w:pPr>
@@ -6584,7 +8050,7 @@
         </w:tc>
         <w:tc>
           <w:tcPr>
-            <w:tcW w:type="dxa" w:w="1134"/>
+            <w:tcW w:type="dxa" w:w="737"/>
           </w:tcPr>
           <w:p>
             <w:pPr>
@@ -6600,7 +8066,23 @@
         </w:tc>
         <w:tc>
           <w:tcPr>
-            <w:tcW w:type="dxa" w:w="3912"/>
+            <w:tcW w:type="dxa" w:w="737"/>
+          </w:tcPr>
+          <w:p>
+            <w:pPr>
+              <w:spacing w:after="20" w:line="240" w:lineRule="auto"/>
+            </w:pPr>
+            <w:r>
+              <w:rPr>
+                <w:sz w:val="17"/>
+              </w:rPr>
+              <w:t>5</w:t>
+            </w:r>
+          </w:p>
+        </w:tc>
+        <w:tc>
+          <w:tcPr>
+            <w:tcW w:type="dxa" w:w="3969"/>
           </w:tcPr>
           <w:p>
             <w:pPr>
@@ -6655,7 +8137,7 @@
         </w:tc>
         <w:tc>
           <w:tcPr>
-            <w:tcW w:type="dxa" w:w="1134"/>
+            <w:tcW w:type="dxa" w:w="737"/>
             <w:shd w:val="clear" w:color="auto" w:fill="F2F5FA"/>
           </w:tcPr>
           <w:p>
@@ -6672,7 +8154,7 @@
         </w:tc>
         <w:tc>
           <w:tcPr>
-            <w:tcW w:type="dxa" w:w="1134"/>
+            <w:tcW w:type="dxa" w:w="737"/>
             <w:shd w:val="clear" w:color="auto" w:fill="F2F5FA"/>
           </w:tcPr>
           <w:p>
@@ -6689,7 +8171,7 @@
         </w:tc>
         <w:tc>
           <w:tcPr>
-            <w:tcW w:type="dxa" w:w="3912"/>
+            <w:tcW w:type="dxa" w:w="737"/>
             <w:shd w:val="clear" w:color="auto" w:fill="F2F5FA"/>
           </w:tcPr>
           <w:p>
@@ -6700,7 +8182,125 @@
               <w:rPr>
                 <w:sz w:val="17"/>
               </w:rPr>
+              <w:t>4</w:t>
+            </w:r>
+          </w:p>
+        </w:tc>
+        <w:tc>
+          <w:tcPr>
+            <w:tcW w:type="dxa" w:w="3969"/>
+            <w:shd w:val="clear" w:color="auto" w:fill="F2F5FA"/>
+          </w:tcPr>
+          <w:p>
+            <w:pPr>
+              <w:spacing w:after="20" w:line="240" w:lineRule="auto"/>
+            </w:pPr>
+            <w:r>
+              <w:rPr>
+                <w:sz w:val="17"/>
+              </w:rPr>
               <w:t>Long technical tables in places</w:t>
+            </w:r>
+          </w:p>
+        </w:tc>
+      </w:tr>
+      <w:tr>
+        <w:trPr>
+          <w:cantSplit w:val="true"/>
+        </w:trPr>
+        <w:tc>
+          <w:tcPr>
+            <w:tcW w:type="dxa" w:w="624"/>
+          </w:tcPr>
+          <w:p>
+            <w:pPr>
+              <w:spacing w:after="20" w:line="240" w:lineRule="auto"/>
+            </w:pPr>
+            <w:r>
+              <w:rPr>
+                <w:sz w:val="17"/>
+              </w:rPr>
+              <w:t>D15</w:t>
+            </w:r>
+          </w:p>
+        </w:tc>
+        <w:tc>
+          <w:tcPr>
+            <w:tcW w:type="dxa" w:w="2608"/>
+          </w:tcPr>
+          <w:p>
+            <w:pPr>
+              <w:spacing w:after="20" w:line="240" w:lineRule="auto"/>
+            </w:pPr>
+            <w:r>
+              <w:rPr>
+                <w:sz w:val="17"/>
+              </w:rPr>
+              <w:t>Data flows and data protection</w:t>
+            </w:r>
+          </w:p>
+        </w:tc>
+        <w:tc>
+          <w:tcPr>
+            <w:tcW w:type="dxa" w:w="737"/>
+          </w:tcPr>
+          <w:p>
+            <w:pPr>
+              <w:spacing w:after="20" w:line="240" w:lineRule="auto"/>
+            </w:pPr>
+            <w:r>
+              <w:rPr>
+                <w:sz w:val="17"/>
+              </w:rPr>
+              <w:t>1</w:t>
+            </w:r>
+          </w:p>
+        </w:tc>
+        <w:tc>
+          <w:tcPr>
+            <w:tcW w:type="dxa" w:w="737"/>
+          </w:tcPr>
+          <w:p>
+            <w:pPr>
+              <w:spacing w:after="20" w:line="240" w:lineRule="auto"/>
+            </w:pPr>
+            <w:r>
+              <w:rPr>
+                <w:sz w:val="17"/>
+              </w:rPr>
+              <w:t>2</w:t>
+            </w:r>
+          </w:p>
+        </w:tc>
+        <w:tc>
+          <w:tcPr>
+            <w:tcW w:type="dxa" w:w="737"/>
+          </w:tcPr>
+          <w:p>
+            <w:pPr>
+              <w:spacing w:after="20" w:line="240" w:lineRule="auto"/>
+            </w:pPr>
+            <w:r>
+              <w:rPr>
+                <w:sz w:val="17"/>
+              </w:rPr>
+              <w:t>4</w:t>
+            </w:r>
+          </w:p>
+        </w:tc>
+        <w:tc>
+          <w:tcPr>
+            <w:tcW w:type="dxa" w:w="3969"/>
+          </w:tcPr>
+          <w:p>
+            <w:pPr>
+              <w:spacing w:after="20" w:line="240" w:lineRule="auto"/>
+            </w:pPr>
+            <w:r>
+              <w:rPr>
+                <w:sz w:val="17"/>
+              </w:rPr>
+              <w:t>Pega Support answers GQ-09 to GQ-11 and the customer's key and classification decisions</w:t>
             </w:r>
           </w:p>
         </w:tc>
@@ -6732,7 +8332,7 @@
         <w:spacing w:before="80"/>
       </w:pPr>
       <w:r>
-        <w:t>Table 6. Open items after version 2.1</w:t>
+        <w:t>Table 6. Open items after version 2.2</w:t>
       </w:r>
     </w:p>
     <w:tbl>
@@ -6861,7 +8461,7 @@
               <w:rPr>
                 <w:sz w:val="17"/>
               </w:rPr>
-              <w:t>Pega Support answers GQ-01 to GQ-08</w:t>
+              <w:t>Pega Support answers GQ-01 to GQ-11</w:t>
             </w:r>
           </w:p>
         </w:tc>
@@ -6931,7 +8531,7 @@
               <w:rPr>
                 <w:sz w:val="17"/>
               </w:rPr>
-              <w:t>OpenSearch provider (OD-03)</w:t>
+              <w:t>Data decisions OD-14 to OD-18: Confluent keys, data class of PERF and PREPROD, topic retention, broken item retention and indexed properties, AKS encryption at host</w:t>
             </w:r>
           </w:p>
         </w:tc>
@@ -6948,7 +8548,7 @@
               <w:rPr>
                 <w:sz w:val="17"/>
               </w:rPr>
-              <w:t>Enterprise architect</w:t>
+              <w:t>Security architect, data security officer</w:t>
             </w:r>
           </w:p>
         </w:tc>
@@ -6965,7 +8565,7 @@
               <w:rPr>
                 <w:sz w:val="17"/>
               </w:rPr>
-              <w:t>M2</w:t>
+              <w:t>M2, before clusters and node pools are created</w:t>
             </w:r>
           </w:p>
         </w:tc>
@@ -6982,7 +8582,7 @@
               <w:rPr>
                 <w:sz w:val="17"/>
               </w:rPr>
-              <w:t>Provider zone awareness, slow-log export and snapshot terms depend on it</w:t>
+              <w:t>Customer key policy and data classification decide them; two cannot be changed after creation</w:t>
             </w:r>
           </w:p>
         </w:tc>
@@ -7003,7 +8603,7 @@
               <w:rPr>
                 <w:sz w:val="17"/>
               </w:rPr>
-              <w:t>DEV tests whose result no document settles: FS-12, FS-24, FS-33, FS-34, IT-06</w:t>
+              <w:t>OpenSearch provider (OD-03)</w:t>
             </w:r>
           </w:p>
         </w:tc>
@@ -7019,7 +8619,7 @@
               <w:rPr>
                 <w:sz w:val="17"/>
               </w:rPr>
-              <w:t>Pega LSA, search and identity teams</w:t>
+              <w:t>Enterprise architect</w:t>
             </w:r>
           </w:p>
         </w:tc>
@@ -7051,7 +8651,7 @@
               <w:rPr>
                 <w:sz w:val="17"/>
               </w:rPr>
-              <w:t>Record the result; it becomes the expected behaviour</w:t>
+              <w:t>Provider zone awareness, slow-log export and snapshot terms depend on it</w:t>
             </w:r>
           </w:p>
         </w:tc>
@@ -7073,7 +8673,7 @@
               <w:rPr>
                 <w:sz w:val="17"/>
               </w:rPr>
-              <w:t>Measured inputs for the sizing calculator</w:t>
+              <w:t>DEV tests whose result no document settles: FS-12, FS-24, FS-33, FS-34, IT-06, DT-04, DT-06, DT-07</w:t>
             </w:r>
           </w:p>
         </w:tc>
@@ -7090,7 +8690,7 @@
               <w:rPr>
                 <w:sz w:val="17"/>
               </w:rPr>
-              <w:t>Performance lead</w:t>
+              <w:t>Pega LSA, search and identity teams</w:t>
             </w:r>
           </w:p>
         </w:tc>
@@ -7107,7 +8707,7 @@
               <w:rPr>
                 <w:sz w:val="17"/>
               </w:rPr>
-              <w:t>M3</w:t>
+              <w:t>M2</w:t>
             </w:r>
           </w:p>
         </w:tc>
@@ -7124,7 +8724,7 @@
               <w:rPr>
                 <w:sz w:val="17"/>
               </w:rPr>
-              <w:t>All example inputs are illustrative</w:t>
+              <w:t>Record the result; it becomes the expected behaviour</w:t>
             </w:r>
           </w:p>
         </w:tc>
@@ -7145,7 +8745,7 @@
               <w:rPr>
                 <w:sz w:val="17"/>
               </w:rPr>
-              <w:t>The customer's Okta token endpoint rate limit</w:t>
+              <w:t>Measured inputs for the sizing calculator</w:t>
             </w:r>
           </w:p>
         </w:tc>
@@ -7161,7 +8761,7 @@
               <w:rPr>
                 <w:sz w:val="17"/>
               </w:rPr>
-              <w:t>Identity team</w:t>
+              <w:t>Performance lead</w:t>
             </w:r>
           </w:p>
         </w:tc>
@@ -7177,7 +8777,7 @@
               <w:rPr>
                 <w:sz w:val="17"/>
               </w:rPr>
-              <w:t>M2</w:t>
+              <w:t>M3</w:t>
             </w:r>
           </w:p>
         </w:tc>
@@ -7193,7 +8793,7 @@
               <w:rPr>
                 <w:sz w:val="17"/>
               </w:rPr>
-              <w:t>Enter in the calculator; compare with the measured token rate</w:t>
+              <w:t>All example inputs are illustrative</w:t>
             </w:r>
           </w:p>
         </w:tc>
@@ -7215,7 +8815,7 @@
               <w:rPr>
                 <w:sz w:val="17"/>
               </w:rPr>
-              <w:t>AKS network policy engine and three-zone node pools (AS-08, AS-09)</w:t>
+              <w:t>The customer's Okta token endpoint rate limit</w:t>
             </w:r>
           </w:p>
         </w:tc>
@@ -7232,7 +8832,7 @@
               <w:rPr>
                 <w:sz w:val="17"/>
               </w:rPr>
-              <w:t>Platform team</w:t>
+              <w:t>Identity team</w:t>
             </w:r>
           </w:p>
         </w:tc>
@@ -7249,7 +8849,7 @@
               <w:rPr>
                 <w:sz w:val="17"/>
               </w:rPr>
-              <w:t>Before M2</w:t>
+              <w:t>M2</w:t>
             </w:r>
           </w:p>
         </w:tc>
@@ -7266,7 +8866,7 @@
               <w:rPr>
                 <w:sz w:val="17"/>
               </w:rPr>
-              <w:t>Both are fixed when the cluster or pool is created</w:t>
+              <w:t>Enter in the calculator; compare with the measured token rate</w:t>
             </w:r>
           </w:p>
         </w:tc>
@@ -7287,6 +8887,76 @@
               <w:rPr>
                 <w:sz w:val="17"/>
               </w:rPr>
+              <w:t>AKS network policy engine and three-zone node pools (AS-08, AS-09)</w:t>
+            </w:r>
+          </w:p>
+        </w:tc>
+        <w:tc>
+          <w:tcPr>
+            <w:tcW w:type="dxa" w:w="1814"/>
+          </w:tcPr>
+          <w:p>
+            <w:pPr>
+              <w:spacing w:after="20" w:line="240" w:lineRule="auto"/>
+            </w:pPr>
+            <w:r>
+              <w:rPr>
+                <w:sz w:val="17"/>
+              </w:rPr>
+              <w:t>Platform team</w:t>
+            </w:r>
+          </w:p>
+        </w:tc>
+        <w:tc>
+          <w:tcPr>
+            <w:tcW w:type="dxa" w:w="1247"/>
+          </w:tcPr>
+          <w:p>
+            <w:pPr>
+              <w:spacing w:after="20" w:line="240" w:lineRule="auto"/>
+            </w:pPr>
+            <w:r>
+              <w:rPr>
+                <w:sz w:val="17"/>
+              </w:rPr>
+              <w:t>Before M2</w:t>
+            </w:r>
+          </w:p>
+        </w:tc>
+        <w:tc>
+          <w:tcPr>
+            <w:tcW w:type="dxa" w:w="3288"/>
+          </w:tcPr>
+          <w:p>
+            <w:pPr>
+              <w:spacing w:after="20" w:line="240" w:lineRule="auto"/>
+            </w:pPr>
+            <w:r>
+              <w:rPr>
+                <w:sz w:val="17"/>
+              </w:rPr>
+              <w:t>Both are fixed when the cluster or pool is created</w:t>
+            </w:r>
+          </w:p>
+        </w:tc>
+      </w:tr>
+      <w:tr>
+        <w:trPr>
+          <w:cantSplit w:val="true"/>
+        </w:trPr>
+        <w:tc>
+          <w:tcPr>
+            <w:tcW w:type="dxa" w:w="3061"/>
+            <w:shd w:val="clear" w:color="auto" w:fill="F2F5FA"/>
+          </w:tcPr>
+          <w:p>
+            <w:pPr>
+              <w:spacing w:after="20" w:line="240" w:lineRule="auto"/>
+            </w:pPr>
+            <w:r>
+              <w:rPr>
+                <w:sz w:val="17"/>
+              </w:rPr>
               <w:t>Permission to reuse third-party images</w:t>
             </w:r>
           </w:p>
@@ -7294,6 +8964,7 @@
         <w:tc>
           <w:tcPr>
             <w:tcW w:type="dxa" w:w="1814"/>
+            <w:shd w:val="clear" w:color="auto" w:fill="F2F5FA"/>
           </w:tcPr>
           <w:p>
             <w:pPr>
@@ -7310,6 +8981,7 @@
         <w:tc>
           <w:tcPr>
             <w:tcW w:type="dxa" w:w="1247"/>
+            <w:shd w:val="clear" w:color="auto" w:fill="F2F5FA"/>
           </w:tcPr>
           <w:p>
             <w:pPr>
@@ -7326,6 +8998,7 @@
         <w:tc>
           <w:tcPr>
             <w:tcW w:type="dxa" w:w="3288"/>
+            <w:shd w:val="clear" w:color="auto" w:fill="F2F5FA"/>
           </w:tcPr>
           <w:p>
             <w:pPr>
@@ -7510,7 +9183,7 @@
         <w:tab/>
       </w:r>
       <w:r>
-        <w:t>Open the sizing calculator, replace the example inputs with measured values, and compare the outputs with Section 15.8 of the runbook.</w:t>
+        <w:t>Open the sizing calculator, replace the example inputs with measured values, and compare the outputs with Section 16.8 of the runbook.</w:t>
       </w:r>
     </w:p>
     <w:p>
@@ -7656,7 +9329,7 @@
         <w:color w:val="595959"/>
         <w:sz w:val="17"/>
       </w:rPr>
-      <w:t>Expert review | Pega 26.1.1 Kafka and Search Runbook v2.0 to v2.1</w:t>
+      <w:t>Expert review | Pega 26.1.1 Kafka and Search Runbook v2.0 to v2.2</w:t>
     </w:r>
   </w:p>
 </w:hdr>

</xml_diff>

<commit_message>
Review report: re-check of F-01 to F-35, findings F-36 to F-45, document readiness scorecard for 2.3; master prompt 3.2 checks
Co-authored-by: ravislr-beep <ravislr-beep@users.noreply.github.com>
</commit_message>
<xml_diff>
--- a/runbook/out/Runbook_Expert_Review.docx
+++ b/runbook/out/Runbook_Expert_Review.docx
@@ -33,7 +33,7 @@
           <w:color w:val="1F3864"/>
           <w:sz w:val="28"/>
         </w:rPr>
-        <w:t>Version 2.0 reviewed and corrected as 2.1; data review of 2.1 issued as 2.2</w:t>
+        <w:t>Version 2.0 reviewed and corrected as 2.1; data review issued as 2.2; second review issued as 2.3</w:t>
       </w:r>
     </w:p>
     <w:p>
@@ -73,12 +73,22 @@
     </w:p>
     <w:p>
       <w:r>
-        <w:t>The other findings were gaps rather than errors: availability zone design, Confluent's enforced connection and request limits, the installer's possible need for Kafka, Okta key rotation and rate limits, OpenSearch sizing formulas, performance testing, sizing and observability. Version 2.1 corrects every finding. Seven items remain open because only the customer, Pega Support or a DEV test can close them (Section 6).</w:t>
+        <w:t>The other findings were gaps rather than errors: availability zone design, Confluent's connection and request limits, the installer's possible need for Kafka, Okta key rotation and rate limits, OpenSearch sizing formulas, performance testing, sizing and observability. Version 2.1 corrects every finding. Seven items remain open because only the customer, Pega Support or a DEV test can close them (Section 7).</w:t>
       </w:r>
     </w:p>
     <w:p>
       <w:r>
         <w:t>A second review of version 2.1 looked at the data itself: what Pega puts on Kafka and into OpenSearch, how sensitive it is, and how it is protected, kept, erased and recovered. It found eleven gaps (F-25 to F-35). The most serious were three choices that are fixed when a resource is created: the Confluent encryption key mode, whose Enterprise variant needs a Key Vault reachable from all networks; AKS encryption at host, without which logs and heap dumps sit on unencrypted ephemeral disks; and the data class of the shared PERF and PREPROD services. Version 2.2 adds Section 9 to the runbook to close them.</w:t>
+      </w:r>
+    </w:p>
+    <w:p>
+      <w:r>
+        <w:t>A third pass reviewed version 2.2 against all fifteen dimensions and re-checked every earlier finding against its source (Section 5). All earlier findings were upheld except one: the correction for F-08 had stated only half of what Confluent's page says about enforcing its limits (F-36). The pass found ten issues in total (F-36 to F-45), none critical. They were an inconsistent zone policy for DEV, SIT and UAT, provider criteria that did not require what the design relies on, no route from the logs to an arbitrary SIEM, and missing procedures and records for tests, the workload model and the sizing inputs. Version 2.3 corrects all of them.</w:t>
+      </w:r>
+    </w:p>
+    <w:p>
+      <w:r>
+        <w:t>With version 2.3 the document scores 5 on every dimension for document readiness (Section 6). What remains open is not missing from the document: it is inputs that only the programme can supply, such as Pega Support answers, customer decisions and measurements from the tests the runbook defines. Each has an owner, a milestone, a recommended answer and a planned response (Section 7).</w:t>
       </w:r>
     </w:p>
     <w:p>
@@ -338,7 +348,7 @@
               <w:rPr>
                 <w:sz w:val="19"/>
               </w:rPr>
-              <w:t>15</w:t>
+              <w:t>21</w:t>
             </w:r>
           </w:p>
         </w:tc>
@@ -394,7 +404,7 @@
               <w:rPr>
                 <w:sz w:val="19"/>
               </w:rPr>
-              <w:t>3</w:t>
+              <w:t>7</w:t>
             </w:r>
           </w:p>
         </w:tc>
@@ -505,6 +515,14 @@
     </w:p>
     <w:p>
       <w:pPr>
+        <w:pStyle w:val="ListBullet"/>
+      </w:pPr>
+      <w:r>
+        <w:t>In the third pass, re-checked each earlier finding against its source by re-rendering the Helm values and re-reading every cited page, to confirm that each finding and its correction were accurate and applicable to this customer.</w:t>
+      </w:r>
+    </w:p>
+    <w:p>
+      <w:pPr>
         <w:pStyle w:val="Heading1"/>
         <w:pageBreakBefore/>
       </w:pPr>
@@ -1725,7 +1743,7 @@
     </w:p>
     <w:p>
       <w:r>
-        <w:t>F-01 to F-24 were found in version 2.0 and corrected in 2.1; F-25 to F-35 were found in 2.1 and corrected in 2.2. The evidence column names the version where the problem was found. Section numbers in the correction column are those of version 2.2, in which Sections 9 to 20 of version 2.1 became Sections 10 to 21.</w:t>
+        <w:t>F-01 to F-24 were found in version 2.0 and corrected in 2.1; F-25 to F-35 were found in 2.1 and corrected in 2.2; F-36 to F-45 were found in 2.2 and corrected in 2.3. The evidence column names the version where the problem was found. Section numbers in the correction column are those of version 2.3, which are the same as in 2.2. In 2.2, Sections 9 to 20 of version 2.1 became Sections 10 to 21.</w:t>
       </w:r>
     </w:p>
     <w:p>
@@ -5812,6 +5830,1046 @@
                 <w:sz w:val="15"/>
               </w:rPr>
               <w:t>Section 9.4</w:t>
+            </w:r>
+          </w:p>
+        </w:tc>
+      </w:tr>
+      <w:tr>
+        <w:trPr>
+          <w:cantSplit w:val="true"/>
+        </w:trPr>
+        <w:tc>
+          <w:tcPr>
+            <w:tcW w:type="dxa" w:w="624"/>
+            <w:shd w:val="clear" w:color="auto" w:fill="F2F5FA"/>
+          </w:tcPr>
+          <w:p>
+            <w:pPr>
+              <w:spacing w:after="20" w:line="240" w:lineRule="auto"/>
+            </w:pPr>
+            <w:r>
+              <w:rPr>
+                <w:sz w:val="15"/>
+              </w:rPr>
+              <w:t>F-36</w:t>
+            </w:r>
+          </w:p>
+        </w:tc>
+        <w:tc>
+          <w:tcPr>
+            <w:tcW w:type="dxa" w:w="680"/>
+            <w:shd w:val="clear" w:color="auto" w:fill="F2F5FA"/>
+          </w:tcPr>
+          <w:p>
+            <w:pPr>
+              <w:spacing w:after="20" w:line="240" w:lineRule="auto"/>
+            </w:pPr>
+            <w:r>
+              <w:rPr>
+                <w:sz w:val="15"/>
+              </w:rPr>
+              <w:t>D2, D13</w:t>
+            </w:r>
+          </w:p>
+        </w:tc>
+        <w:tc>
+          <w:tcPr>
+            <w:tcW w:type="dxa" w:w="907"/>
+            <w:shd w:val="clear" w:color="auto" w:fill="F2F5FA"/>
+          </w:tcPr>
+          <w:p>
+            <w:pPr>
+              <w:spacing w:after="20" w:line="240" w:lineRule="auto"/>
+            </w:pPr>
+            <w:r>
+              <w:rPr>
+                <w:sz w:val="15"/>
+              </w:rPr>
+              <w:t>Medium</w:t>
+            </w:r>
+          </w:p>
+        </w:tc>
+        <w:tc>
+          <w:tcPr>
+            <w:tcW w:type="dxa" w:w="3175"/>
+            <w:shd w:val="clear" w:color="auto" w:fill="F2F5FA"/>
+          </w:tcPr>
+          <w:p>
+            <w:pPr>
+              <w:spacing w:after="20" w:line="240" w:lineRule="auto"/>
+            </w:pPr>
+            <w:r>
+              <w:rPr>
+                <w:sz w:val="15"/>
+              </w:rPr>
+              <w:t>The correction for F-08 said Confluent now enforces the limits. The same Confluent page also says the limits are not yet strictly enforced and are not a hard cutoff, and that exceeding them may cause throttling, delayed connections or unpredictable performance. The runbook stated only half of the source.</w:t>
+            </w:r>
+          </w:p>
+        </w:tc>
+        <w:tc>
+          <w:tcPr>
+            <w:tcW w:type="dxa" w:w="1928"/>
+            <w:shd w:val="clear" w:color="auto" w:fill="F2F5FA"/>
+          </w:tcPr>
+          <w:p>
+            <w:pPr>
+              <w:spacing w:after="20" w:line="240" w:lineRule="auto"/>
+            </w:pPr>
+            <w:r>
+              <w:rPr>
+                <w:sz w:val="15"/>
+              </w:rPr>
+              <w:t>v2.2 Section 6.3 callout and facts table; R31 re-read on 2 October 2026</w:t>
+            </w:r>
+          </w:p>
+        </w:tc>
+        <w:tc>
+          <w:tcPr>
+            <w:tcW w:type="dxa" w:w="2098"/>
+            <w:shd w:val="clear" w:color="auto" w:fill="F2F5FA"/>
+          </w:tcPr>
+          <w:p>
+            <w:pPr>
+              <w:spacing w:after="20" w:line="240" w:lineRule="auto"/>
+            </w:pPr>
+            <w:r>
+              <w:rPr>
+                <w:sz w:val="15"/>
+              </w:rPr>
+              <w:t>Callout states both statements; plan as if hard; RC-14 added; facts row, failure table and Section 16.1 reworded</w:t>
+            </w:r>
+          </w:p>
+        </w:tc>
+      </w:tr>
+      <w:tr>
+        <w:trPr>
+          <w:cantSplit w:val="true"/>
+        </w:trPr>
+        <w:tc>
+          <w:tcPr>
+            <w:tcW w:type="dxa" w:w="624"/>
+          </w:tcPr>
+          <w:p>
+            <w:pPr>
+              <w:spacing w:after="20" w:line="240" w:lineRule="auto"/>
+            </w:pPr>
+            <w:r>
+              <w:rPr>
+                <w:sz w:val="15"/>
+              </w:rPr>
+              <w:t>F-37</w:t>
+            </w:r>
+          </w:p>
+        </w:tc>
+        <w:tc>
+          <w:tcPr>
+            <w:tcW w:type="dxa" w:w="680"/>
+          </w:tcPr>
+          <w:p>
+            <w:pPr>
+              <w:spacing w:after="20" w:line="240" w:lineRule="auto"/>
+            </w:pPr>
+            <w:r>
+              <w:rPr>
+                <w:sz w:val="15"/>
+              </w:rPr>
+              <w:t>D6</w:t>
+            </w:r>
+          </w:p>
+        </w:tc>
+        <w:tc>
+          <w:tcPr>
+            <w:tcW w:type="dxa" w:w="907"/>
+          </w:tcPr>
+          <w:p>
+            <w:pPr>
+              <w:spacing w:after="20" w:line="240" w:lineRule="auto"/>
+            </w:pPr>
+            <w:r>
+              <w:rPr>
+                <w:sz w:val="15"/>
+              </w:rPr>
+              <w:t>Medium</w:t>
+            </w:r>
+          </w:p>
+        </w:tc>
+        <w:tc>
+          <w:tcPr>
+            <w:tcW w:type="dxa" w:w="3175"/>
+          </w:tcPr>
+          <w:p>
+            <w:pPr>
+              <w:spacing w:after="20" w:line="240" w:lineRule="auto"/>
+            </w:pPr>
+            <w:r>
+              <w:rPr>
+                <w:sz w:val="15"/>
+              </w:rPr>
+              <w:t>Section 4.6 contradicted itself: the text let DEV, SIT and UAT run in fewer zones, the table required three zones for every node pool. Zones cannot be changed after a pool is created, and the zone tests run first in DEV.</w:t>
+            </w:r>
+          </w:p>
+        </w:tc>
+        <w:tc>
+          <w:tcPr>
+            <w:tcW w:type="dxa" w:w="1928"/>
+          </w:tcPr>
+          <w:p>
+            <w:pPr>
+              <w:spacing w:after="20" w:line="240" w:lineRule="auto"/>
+            </w:pPr>
+            <w:r>
+              <w:rPr>
+                <w:sz w:val="15"/>
+              </w:rPr>
+              <w:t>v2.2 Section 4.6; R59</w:t>
+            </w:r>
+          </w:p>
+        </w:tc>
+        <w:tc>
+          <w:tcPr>
+            <w:tcW w:type="dxa" w:w="2098"/>
+          </w:tcPr>
+          <w:p>
+            <w:pPr>
+              <w:spacing w:after="20" w:line="240" w:lineRule="auto"/>
+            </w:pPr>
+            <w:r>
+              <w:rPr>
+                <w:sz w:val="15"/>
+              </w:rPr>
+              <w:t>One three-zone policy for all environments; zone headroom 1.5 for PERF, PREPROD and PROD and 1.0 for DEV, SIT and UAT; headroom is now a calculator input per pool</w:t>
+            </w:r>
+          </w:p>
+        </w:tc>
+      </w:tr>
+      <w:tr>
+        <w:trPr>
+          <w:cantSplit w:val="true"/>
+        </w:trPr>
+        <w:tc>
+          <w:tcPr>
+            <w:tcW w:type="dxa" w:w="624"/>
+            <w:shd w:val="clear" w:color="auto" w:fill="F2F5FA"/>
+          </w:tcPr>
+          <w:p>
+            <w:pPr>
+              <w:spacing w:after="20" w:line="240" w:lineRule="auto"/>
+            </w:pPr>
+            <w:r>
+              <w:rPr>
+                <w:sz w:val="15"/>
+              </w:rPr>
+              <w:t>F-38</w:t>
+            </w:r>
+          </w:p>
+        </w:tc>
+        <w:tc>
+          <w:tcPr>
+            <w:tcW w:type="dxa" w:w="680"/>
+            <w:shd w:val="clear" w:color="auto" w:fill="F2F5FA"/>
+          </w:tcPr>
+          <w:p>
+            <w:pPr>
+              <w:spacing w:after="20" w:line="240" w:lineRule="auto"/>
+            </w:pPr>
+            <w:r>
+              <w:rPr>
+                <w:sz w:val="15"/>
+              </w:rPr>
+              <w:t>D3, D6</w:t>
+            </w:r>
+          </w:p>
+        </w:tc>
+        <w:tc>
+          <w:tcPr>
+            <w:tcW w:type="dxa" w:w="907"/>
+            <w:shd w:val="clear" w:color="auto" w:fill="F2F5FA"/>
+          </w:tcPr>
+          <w:p>
+            <w:pPr>
+              <w:spacing w:after="20" w:line="240" w:lineRule="auto"/>
+            </w:pPr>
+            <w:r>
+              <w:rPr>
+                <w:sz w:val="15"/>
+              </w:rPr>
+              <w:t>Medium</w:t>
+            </w:r>
+          </w:p>
+        </w:tc>
+        <w:tc>
+          <w:tcPr>
+            <w:tcW w:type="dxa" w:w="3175"/>
+            <w:shd w:val="clear" w:color="auto" w:fill="F2F5FA"/>
+          </w:tcPr>
+          <w:p>
+            <w:pPr>
+              <w:spacing w:after="20" w:line="240" w:lineRule="auto"/>
+            </w:pPr>
+            <w:r>
+              <w:rPr>
+                <w:sz w:val="15"/>
+              </w:rPr>
+              <w:t>Section 7.4 relies on provider zone awareness, but the provider worksheet did not require nodes in three zones with shard allocation awareness. A provider could pass without it.</w:t>
+            </w:r>
+          </w:p>
+        </w:tc>
+        <w:tc>
+          <w:tcPr>
+            <w:tcW w:type="dxa" w:w="1928"/>
+            <w:shd w:val="clear" w:color="auto" w:fill="F2F5FA"/>
+          </w:tcPr>
+          <w:p>
+            <w:pPr>
+              <w:spacing w:after="20" w:line="240" w:lineRule="auto"/>
+            </w:pPr>
+            <w:r>
+              <w:rPr>
+                <w:sz w:val="15"/>
+              </w:rPr>
+              <w:t>v2.2 Section 7.3; R37</w:t>
+            </w:r>
+          </w:p>
+        </w:tc>
+        <w:tc>
+          <w:tcPr>
+            <w:tcW w:type="dxa" w:w="2098"/>
+            <w:shd w:val="clear" w:color="auto" w:fill="F2F5FA"/>
+          </w:tcPr>
+          <w:p>
+            <w:pPr>
+              <w:spacing w:after="20" w:line="240" w:lineRule="auto"/>
+            </w:pPr>
+            <w:r>
+              <w:rPr>
+                <w:sz w:val="15"/>
+              </w:rPr>
+              <w:t>Mandatory criterion added</w:t>
+            </w:r>
+          </w:p>
+        </w:tc>
+      </w:tr>
+      <w:tr>
+        <w:trPr>
+          <w:cantSplit w:val="true"/>
+        </w:trPr>
+        <w:tc>
+          <w:tcPr>
+            <w:tcW w:type="dxa" w:w="624"/>
+          </w:tcPr>
+          <w:p>
+            <w:pPr>
+              <w:spacing w:after="20" w:line="240" w:lineRule="auto"/>
+            </w:pPr>
+            <w:r>
+              <w:rPr>
+                <w:sz w:val="15"/>
+              </w:rPr>
+              <w:t>F-39</w:t>
+            </w:r>
+          </w:p>
+        </w:tc>
+        <w:tc>
+          <w:tcPr>
+            <w:tcW w:type="dxa" w:w="680"/>
+          </w:tcPr>
+          <w:p>
+            <w:pPr>
+              <w:spacing w:after="20" w:line="240" w:lineRule="auto"/>
+            </w:pPr>
+            <w:r>
+              <w:rPr>
+                <w:sz w:val="15"/>
+              </w:rPr>
+              <w:t>D11</w:t>
+            </w:r>
+          </w:p>
+        </w:tc>
+        <w:tc>
+          <w:tcPr>
+            <w:tcW w:type="dxa" w:w="907"/>
+          </w:tcPr>
+          <w:p>
+            <w:pPr>
+              <w:spacing w:after="20" w:line="240" w:lineRule="auto"/>
+            </w:pPr>
+            <w:r>
+              <w:rPr>
+                <w:sz w:val="15"/>
+              </w:rPr>
+              <w:t>Medium</w:t>
+            </w:r>
+          </w:p>
+        </w:tc>
+        <w:tc>
+          <w:tcPr>
+            <w:tcW w:type="dxa" w:w="3175"/>
+          </w:tcPr>
+          <w:p>
+            <w:pPr>
+              <w:spacing w:after="20" w:line="240" w:lineRule="auto"/>
+            </w:pPr>
+            <w:r>
+              <w:rPr>
+                <w:sz w:val="15"/>
+              </w:rPr>
+              <w:t>Provider log export was only a scored item for metrics, and no route to a SIEM was given. Okta log streaming supports only Amazon EventBridge and Splunk Cloud, so "log streaming to the SIEM" was not possible for most SIEMs.</w:t>
+            </w:r>
+          </w:p>
+        </w:tc>
+        <w:tc>
+          <w:tcPr>
+            <w:tcW w:type="dxa" w:w="1928"/>
+          </w:tcPr>
+          <w:p>
+            <w:pPr>
+              <w:spacing w:after="20" w:line="240" w:lineRule="auto"/>
+            </w:pPr>
+            <w:r>
+              <w:rPr>
+                <w:sz w:val="15"/>
+              </w:rPr>
+              <w:t>v2.2 Sections 7.3 and 19.1; R80, R81, R82</w:t>
+            </w:r>
+          </w:p>
+        </w:tc>
+        <w:tc>
+          <w:tcPr>
+            <w:tcW w:type="dxa" w:w="2098"/>
+          </w:tcPr>
+          <w:p>
+            <w:pPr>
+              <w:spacing w:after="20" w:line="240" w:lineRule="auto"/>
+            </w:pPr>
+            <w:r>
+              <w:rPr>
+                <w:sz w:val="15"/>
+              </w:rPr>
+              <w:t>Mandatory criterion for metrics and logs; SIEM route table for Azure, Confluent and Okta with a test of each route; scored weights rebalanced</w:t>
+            </w:r>
+          </w:p>
+        </w:tc>
+      </w:tr>
+      <w:tr>
+        <w:trPr>
+          <w:cantSplit w:val="true"/>
+        </w:trPr>
+        <w:tc>
+          <w:tcPr>
+            <w:tcW w:type="dxa" w:w="624"/>
+            <w:shd w:val="clear" w:color="auto" w:fill="F2F5FA"/>
+          </w:tcPr>
+          <w:p>
+            <w:pPr>
+              <w:spacing w:after="20" w:line="240" w:lineRule="auto"/>
+            </w:pPr>
+            <w:r>
+              <w:rPr>
+                <w:sz w:val="15"/>
+              </w:rPr>
+              <w:t>F-40</w:t>
+            </w:r>
+          </w:p>
+        </w:tc>
+        <w:tc>
+          <w:tcPr>
+            <w:tcW w:type="dxa" w:w="680"/>
+            <w:shd w:val="clear" w:color="auto" w:fill="F2F5FA"/>
+          </w:tcPr>
+          <w:p>
+            <w:pPr>
+              <w:spacing w:after="20" w:line="240" w:lineRule="auto"/>
+            </w:pPr>
+            <w:r>
+              <w:rPr>
+                <w:sz w:val="15"/>
+              </w:rPr>
+              <w:t>D8</w:t>
+            </w:r>
+          </w:p>
+        </w:tc>
+        <w:tc>
+          <w:tcPr>
+            <w:tcW w:type="dxa" w:w="907"/>
+            <w:shd w:val="clear" w:color="auto" w:fill="F2F5FA"/>
+          </w:tcPr>
+          <w:p>
+            <w:pPr>
+              <w:spacing w:after="20" w:line="240" w:lineRule="auto"/>
+            </w:pPr>
+            <w:r>
+              <w:rPr>
+                <w:sz w:val="15"/>
+              </w:rPr>
+              <w:t>Medium</w:t>
+            </w:r>
+          </w:p>
+        </w:tc>
+        <w:tc>
+          <w:tcPr>
+            <w:tcW w:type="dxa" w:w="3175"/>
+            <w:shd w:val="clear" w:color="auto" w:fill="F2F5FA"/>
+          </w:tcPr>
+          <w:p>
+            <w:pPr>
+              <w:spacing w:after="20" w:line="240" w:lineRule="auto"/>
+            </w:pPr>
+            <w:r>
+              <w:rPr>
+                <w:sz w:val="15"/>
+              </w:rPr>
+              <w:t>Tests whose behaviour no document settles had no record format and no planned response if the result was unfavourable, so a result could stop the programme with no plan.</w:t>
+            </w:r>
+          </w:p>
+        </w:tc>
+        <w:tc>
+          <w:tcPr>
+            <w:tcW w:type="dxa" w:w="1928"/>
+            <w:shd w:val="clear" w:color="auto" w:fill="F2F5FA"/>
+          </w:tcPr>
+          <w:p>
+            <w:pPr>
+              <w:spacing w:after="20" w:line="240" w:lineRule="auto"/>
+            </w:pPr>
+            <w:r>
+              <w:rPr>
+                <w:sz w:val="15"/>
+              </w:rPr>
+              <w:t>v2.2 Section 15</w:t>
+            </w:r>
+          </w:p>
+        </w:tc>
+        <w:tc>
+          <w:tcPr>
+            <w:tcW w:type="dxa" w:w="2098"/>
+            <w:shd w:val="clear" w:color="auto" w:fill="F2F5FA"/>
+          </w:tcPr>
+          <w:p>
+            <w:pPr>
+              <w:spacing w:after="20" w:line="240" w:lineRule="auto"/>
+            </w:pPr>
+            <w:r>
+              <w:rPr>
+                <w:sz w:val="15"/>
+              </w:rPr>
+              <w:t>Section 15.9: test result record and a planned response for FS-12, FS-24, FS-33, FS-34, IT-06, DT-04, DT-06 and DT-07</w:t>
+            </w:r>
+          </w:p>
+        </w:tc>
+      </w:tr>
+      <w:tr>
+        <w:trPr>
+          <w:cantSplit w:val="true"/>
+        </w:trPr>
+        <w:tc>
+          <w:tcPr>
+            <w:tcW w:type="dxa" w:w="624"/>
+          </w:tcPr>
+          <w:p>
+            <w:pPr>
+              <w:spacing w:after="20" w:line="240" w:lineRule="auto"/>
+            </w:pPr>
+            <w:r>
+              <w:rPr>
+                <w:sz w:val="15"/>
+              </w:rPr>
+              <w:t>F-41</w:t>
+            </w:r>
+          </w:p>
+        </w:tc>
+        <w:tc>
+          <w:tcPr>
+            <w:tcW w:type="dxa" w:w="680"/>
+          </w:tcPr>
+          <w:p>
+            <w:pPr>
+              <w:spacing w:after="20" w:line="240" w:lineRule="auto"/>
+            </w:pPr>
+            <w:r>
+              <w:rPr>
+                <w:sz w:val="15"/>
+              </w:rPr>
+              <w:t>D9</w:t>
+            </w:r>
+          </w:p>
+        </w:tc>
+        <w:tc>
+          <w:tcPr>
+            <w:tcW w:type="dxa" w:w="907"/>
+          </w:tcPr>
+          <w:p>
+            <w:pPr>
+              <w:spacing w:after="20" w:line="240" w:lineRule="auto"/>
+            </w:pPr>
+            <w:r>
+              <w:rPr>
+                <w:sz w:val="15"/>
+              </w:rPr>
+              <w:t>Medium</w:t>
+            </w:r>
+          </w:p>
+        </w:tc>
+        <w:tc>
+          <w:tcPr>
+            <w:tcW w:type="dxa" w:w="3175"/>
+          </w:tcPr>
+          <w:p>
+            <w:pPr>
+              <w:spacing w:after="20" w:line="240" w:lineRule="auto"/>
+            </w:pPr>
+            <w:r>
+              <w:rPr>
+                <w:sz w:val="15"/>
+              </w:rPr>
+              <w:t>The workload model listed inputs but no procedure: no observation period, no rule for choosing the design peak hour, no targets to agree and no record to approve.</w:t>
+            </w:r>
+          </w:p>
+        </w:tc>
+        <w:tc>
+          <w:tcPr>
+            <w:tcW w:type="dxa" w:w="1928"/>
+          </w:tcPr>
+          <w:p>
+            <w:pPr>
+              <w:spacing w:after="20" w:line="240" w:lineRule="auto"/>
+            </w:pPr>
+            <w:r>
+              <w:rPr>
+                <w:sz w:val="15"/>
+              </w:rPr>
+              <w:t>v2.2 Section 16.2</w:t>
+            </w:r>
+          </w:p>
+        </w:tc>
+        <w:tc>
+          <w:tcPr>
+            <w:tcW w:type="dxa" w:w="2098"/>
+          </w:tcPr>
+          <w:p>
+            <w:pPr>
+              <w:spacing w:after="20" w:line="240" w:lineRule="auto"/>
+            </w:pPr>
+            <w:r>
+              <w:rPr>
+                <w:sz w:val="15"/>
+              </w:rPr>
+              <w:t>Six-step procedure and a workload model record for the business owner's approval</w:t>
+            </w:r>
+          </w:p>
+        </w:tc>
+      </w:tr>
+      <w:tr>
+        <w:trPr>
+          <w:cantSplit w:val="true"/>
+        </w:trPr>
+        <w:tc>
+          <w:tcPr>
+            <w:tcW w:type="dxa" w:w="624"/>
+            <w:shd w:val="clear" w:color="auto" w:fill="F2F5FA"/>
+          </w:tcPr>
+          <w:p>
+            <w:pPr>
+              <w:spacing w:after="20" w:line="240" w:lineRule="auto"/>
+            </w:pPr>
+            <w:r>
+              <w:rPr>
+                <w:sz w:val="15"/>
+              </w:rPr>
+              <w:t>F-42</w:t>
+            </w:r>
+          </w:p>
+        </w:tc>
+        <w:tc>
+          <w:tcPr>
+            <w:tcW w:type="dxa" w:w="680"/>
+            <w:shd w:val="clear" w:color="auto" w:fill="F2F5FA"/>
+          </w:tcPr>
+          <w:p>
+            <w:pPr>
+              <w:spacing w:after="20" w:line="240" w:lineRule="auto"/>
+            </w:pPr>
+            <w:r>
+              <w:rPr>
+                <w:sz w:val="15"/>
+              </w:rPr>
+              <w:t>D10</w:t>
+            </w:r>
+          </w:p>
+        </w:tc>
+        <w:tc>
+          <w:tcPr>
+            <w:tcW w:type="dxa" w:w="907"/>
+            <w:shd w:val="clear" w:color="auto" w:fill="F2F5FA"/>
+          </w:tcPr>
+          <w:p>
+            <w:pPr>
+              <w:spacing w:after="20" w:line="240" w:lineRule="auto"/>
+            </w:pPr>
+            <w:r>
+              <w:rPr>
+                <w:sz w:val="15"/>
+              </w:rPr>
+              <w:t>Low</w:t>
+            </w:r>
+          </w:p>
+        </w:tc>
+        <w:tc>
+          <w:tcPr>
+            <w:tcW w:type="dxa" w:w="3175"/>
+            <w:shd w:val="clear" w:color="auto" w:fill="F2F5FA"/>
+          </w:tcPr>
+          <w:p>
+            <w:pPr>
+              <w:spacing w:after="20" w:line="240" w:lineRule="auto"/>
+            </w:pPr>
+            <w:r>
+              <w:rPr>
+                <w:sz w:val="15"/>
+              </w:rPr>
+              <w:t>The calculator's illustrative inputs were not mapped to the measurement that replaces each one, so the M3 sign-off condition could not be checked.</w:t>
+            </w:r>
+          </w:p>
+        </w:tc>
+        <w:tc>
+          <w:tcPr>
+            <w:tcW w:type="dxa" w:w="1928"/>
+            <w:shd w:val="clear" w:color="auto" w:fill="F2F5FA"/>
+          </w:tcPr>
+          <w:p>
+            <w:pPr>
+              <w:spacing w:after="20" w:line="240" w:lineRule="auto"/>
+            </w:pPr>
+            <w:r>
+              <w:rPr>
+                <w:sz w:val="15"/>
+              </w:rPr>
+              <w:t>v2.2 Section 16.9 and Appendix H</w:t>
+            </w:r>
+          </w:p>
+        </w:tc>
+        <w:tc>
+          <w:tcPr>
+            <w:tcW w:type="dxa" w:w="2098"/>
+            <w:shd w:val="clear" w:color="auto" w:fill="F2F5FA"/>
+          </w:tcPr>
+          <w:p>
+            <w:pPr>
+              <w:spacing w:after="20" w:line="240" w:lineRule="auto"/>
+            </w:pPr>
+            <w:r>
+              <w:rPr>
+                <w:sz w:val="15"/>
+              </w:rPr>
+              <w:t>Section 16.9.1 maps every input to a test, a method and an owner</w:t>
+            </w:r>
+          </w:p>
+        </w:tc>
+      </w:tr>
+      <w:tr>
+        <w:trPr>
+          <w:cantSplit w:val="true"/>
+        </w:trPr>
+        <w:tc>
+          <w:tcPr>
+            <w:tcW w:type="dxa" w:w="624"/>
+          </w:tcPr>
+          <w:p>
+            <w:pPr>
+              <w:spacing w:after="20" w:line="240" w:lineRule="auto"/>
+            </w:pPr>
+            <w:r>
+              <w:rPr>
+                <w:sz w:val="15"/>
+              </w:rPr>
+              <w:t>F-43</w:t>
+            </w:r>
+          </w:p>
+        </w:tc>
+        <w:tc>
+          <w:tcPr>
+            <w:tcW w:type="dxa" w:w="680"/>
+          </w:tcPr>
+          <w:p>
+            <w:pPr>
+              <w:spacing w:after="20" w:line="240" w:lineRule="auto"/>
+            </w:pPr>
+            <w:r>
+              <w:rPr>
+                <w:sz w:val="15"/>
+              </w:rPr>
+              <w:t>D14</w:t>
+            </w:r>
+          </w:p>
+        </w:tc>
+        <w:tc>
+          <w:tcPr>
+            <w:tcW w:type="dxa" w:w="907"/>
+          </w:tcPr>
+          <w:p>
+            <w:pPr>
+              <w:spacing w:after="20" w:line="240" w:lineRule="auto"/>
+            </w:pPr>
+            <w:r>
+              <w:rPr>
+                <w:sz w:val="15"/>
+              </w:rPr>
+              <w:t>Low</w:t>
+            </w:r>
+          </w:p>
+        </w:tc>
+        <w:tc>
+          <w:tcPr>
+            <w:tcW w:type="dxa" w:w="3175"/>
+          </w:tcPr>
+          <w:p>
+            <w:pPr>
+              <w:spacing w:after="20" w:line="240" w:lineRule="auto"/>
+            </w:pPr>
+            <w:r>
+              <w:rPr>
+                <w:sz w:val="15"/>
+              </w:rPr>
+              <w:t>Two 36-row tables (chart keys and failure catalogue) spanned several pages; the SRS chart-default row sat between two Pega sizing rows.</w:t>
+            </w:r>
+          </w:p>
+        </w:tc>
+        <w:tc>
+          <w:tcPr>
+            <w:tcW w:type="dxa" w:w="1928"/>
+          </w:tcPr>
+          <w:p>
+            <w:pPr>
+              <w:spacing w:after="20" w:line="240" w:lineRule="auto"/>
+            </w:pPr>
+            <w:r>
+              <w:rPr>
+                <w:sz w:val="15"/>
+              </w:rPr>
+              <w:t>v2.2 Sections 10.3 and 15.6; Table in Section 7.4</w:t>
+            </w:r>
+          </w:p>
+        </w:tc>
+        <w:tc>
+          <w:tcPr>
+            <w:tcW w:type="dxa" w:w="2098"/>
+          </w:tcPr>
+          <w:p>
+            <w:pPr>
+              <w:spacing w:after="20" w:line="240" w:lineRule="auto"/>
+            </w:pPr>
+            <w:r>
+              <w:rPr>
+                <w:sz w:val="15"/>
+              </w:rPr>
+              <w:t>Chart keys split into platform and Kafka-search tables; failure catalogue split by layer; row moved and its source named</w:t>
+            </w:r>
+          </w:p>
+        </w:tc>
+      </w:tr>
+      <w:tr>
+        <w:trPr>
+          <w:cantSplit w:val="true"/>
+        </w:trPr>
+        <w:tc>
+          <w:tcPr>
+            <w:tcW w:type="dxa" w:w="624"/>
+            <w:shd w:val="clear" w:color="auto" w:fill="F2F5FA"/>
+          </w:tcPr>
+          <w:p>
+            <w:pPr>
+              <w:spacing w:after="20" w:line="240" w:lineRule="auto"/>
+            </w:pPr>
+            <w:r>
+              <w:rPr>
+                <w:sz w:val="15"/>
+              </w:rPr>
+              <w:t>F-44</w:t>
+            </w:r>
+          </w:p>
+        </w:tc>
+        <w:tc>
+          <w:tcPr>
+            <w:tcW w:type="dxa" w:w="680"/>
+            <w:shd w:val="clear" w:color="auto" w:fill="F2F5FA"/>
+          </w:tcPr>
+          <w:p>
+            <w:pPr>
+              <w:spacing w:after="20" w:line="240" w:lineRule="auto"/>
+            </w:pPr>
+            <w:r>
+              <w:rPr>
+                <w:sz w:val="15"/>
+              </w:rPr>
+              <w:t>D5, D15</w:t>
+            </w:r>
+          </w:p>
+        </w:tc>
+        <w:tc>
+          <w:tcPr>
+            <w:tcW w:type="dxa" w:w="907"/>
+            <w:shd w:val="clear" w:color="auto" w:fill="F2F5FA"/>
+          </w:tcPr>
+          <w:p>
+            <w:pPr>
+              <w:spacing w:after="20" w:line="240" w:lineRule="auto"/>
+            </w:pPr>
+            <w:r>
+              <w:rPr>
+                <w:sz w:val="15"/>
+              </w:rPr>
+              <w:t>Low</w:t>
+            </w:r>
+          </w:p>
+        </w:tc>
+        <w:tc>
+          <w:tcPr>
+            <w:tcW w:type="dxa" w:w="3175"/>
+            <w:shd w:val="clear" w:color="auto" w:fill="F2F5FA"/>
+          </w:tcPr>
+          <w:p>
+            <w:pPr>
+              <w:spacing w:after="20" w:line="240" w:lineRule="auto"/>
+            </w:pPr>
+            <w:r>
+              <w:rPr>
+                <w:sz w:val="15"/>
+              </w:rPr>
+              <w:t>AC-7 needs the data security officer to accept Section 9, but the approvals table had no such role.</w:t>
+            </w:r>
+          </w:p>
+        </w:tc>
+        <w:tc>
+          <w:tcPr>
+            <w:tcW w:type="dxa" w:w="1928"/>
+            <w:shd w:val="clear" w:color="auto" w:fill="F2F5FA"/>
+          </w:tcPr>
+          <w:p>
+            <w:pPr>
+              <w:spacing w:after="20" w:line="240" w:lineRule="auto"/>
+            </w:pPr>
+            <w:r>
+              <w:rPr>
+                <w:sz w:val="15"/>
+              </w:rPr>
+              <w:t>v2.2 approvals table</w:t>
+            </w:r>
+          </w:p>
+        </w:tc>
+        <w:tc>
+          <w:tcPr>
+            <w:tcW w:type="dxa" w:w="2098"/>
+            <w:shd w:val="clear" w:color="auto" w:fill="F2F5FA"/>
+          </w:tcPr>
+          <w:p>
+            <w:pPr>
+              <w:spacing w:after="20" w:line="240" w:lineRule="auto"/>
+            </w:pPr>
+            <w:r>
+              <w:rPr>
+                <w:sz w:val="15"/>
+              </w:rPr>
+              <w:t>Role added to the approvals</w:t>
+            </w:r>
+          </w:p>
+        </w:tc>
+      </w:tr>
+      <w:tr>
+        <w:trPr>
+          <w:cantSplit w:val="true"/>
+        </w:trPr>
+        <w:tc>
+          <w:tcPr>
+            <w:tcW w:type="dxa" w:w="624"/>
+          </w:tcPr>
+          <w:p>
+            <w:pPr>
+              <w:spacing w:after="20" w:line="240" w:lineRule="auto"/>
+            </w:pPr>
+            <w:r>
+              <w:rPr>
+                <w:sz w:val="15"/>
+              </w:rPr>
+              <w:t>F-45</w:t>
+            </w:r>
+          </w:p>
+        </w:tc>
+        <w:tc>
+          <w:tcPr>
+            <w:tcW w:type="dxa" w:w="680"/>
+          </w:tcPr>
+          <w:p>
+            <w:pPr>
+              <w:spacing w:after="20" w:line="240" w:lineRule="auto"/>
+            </w:pPr>
+            <w:r>
+              <w:rPr>
+                <w:sz w:val="15"/>
+              </w:rPr>
+              <w:t>D3</w:t>
+            </w:r>
+          </w:p>
+        </w:tc>
+        <w:tc>
+          <w:tcPr>
+            <w:tcW w:type="dxa" w:w="907"/>
+          </w:tcPr>
+          <w:p>
+            <w:pPr>
+              <w:spacing w:after="20" w:line="240" w:lineRule="auto"/>
+            </w:pPr>
+            <w:r>
+              <w:rPr>
+                <w:sz w:val="15"/>
+              </w:rPr>
+              <w:t>Low</w:t>
+            </w:r>
+          </w:p>
+        </w:tc>
+        <w:tc>
+          <w:tcPr>
+            <w:tcW w:type="dxa" w:w="3175"/>
+          </w:tcPr>
+          <w:p>
+            <w:pPr>
+              <w:spacing w:after="20" w:line="240" w:lineRule="auto"/>
+            </w:pPr>
+            <w:r>
+              <w:rPr>
+                <w:sz w:val="15"/>
+              </w:rPr>
+              <w:t>After the customer-managed key row was added in 2.2, the scored provider weights totalled 110.</w:t>
+            </w:r>
+          </w:p>
+        </w:tc>
+        <w:tc>
+          <w:tcPr>
+            <w:tcW w:type="dxa" w:w="1928"/>
+          </w:tcPr>
+          <w:p>
+            <w:pPr>
+              <w:spacing w:after="20" w:line="240" w:lineRule="auto"/>
+            </w:pPr>
+            <w:r>
+              <w:rPr>
+                <w:sz w:val="15"/>
+              </w:rPr>
+              <w:t>v2.2 Section 7.3</w:t>
+            </w:r>
+          </w:p>
+        </w:tc>
+        <w:tc>
+          <w:tcPr>
+            <w:tcW w:type="dxa" w:w="2098"/>
+          </w:tcPr>
+          <w:p>
+            <w:pPr>
+              <w:spacing w:after="20" w:line="240" w:lineRule="auto"/>
+            </w:pPr>
+            <w:r>
+              <w:rPr>
+                <w:sz w:val="15"/>
+              </w:rPr>
+              <w:t>Weights total 100; caption states it</w:t>
             </w:r>
           </w:p>
         </w:tc>
@@ -6580,12 +7638,12 @@
         <w:pageBreakBefore/>
       </w:pPr>
       <w:r>
-        <w:t>5  Scorecard</w:t>
+        <w:t>5  Re-check of earlier findings</w:t>
       </w:r>
     </w:p>
     <w:p>
       <w:r>
-        <w:t>Scores are the reviewer's judgement on a five-point scale: 1 missing or wrong; 2 present with errors that would cause failures; 3 correct but with material gaps; 4 complete for the current stage, with inputs still to be measured; 5 complete and verified. A score of 4 after correction means the method is in place but depends on measurements or decisions that only the programme can supply.</w:t>
+        <w:t>A finding is only useful if it is true and applies to this customer's design. Before the third pass, each earlier finding was checked again against its evidence.</w:t>
       </w:r>
     </w:p>
     <w:p>
@@ -6595,7 +7653,654 @@
         <w:spacing w:before="80"/>
       </w:pPr>
       <w:r>
-        <w:t>Table 5. Scorecard by version</w:t>
+        <w:t>Table 5. Re-check of findings F-01 to F-35</w:t>
+      </w:r>
+    </w:p>
+    <w:tbl>
+      <w:tblPr>
+        <w:jc w:val="center"/>
+        <w:tblLayout w:type="fixed"/>
+        <w:tblLook w:firstColumn="1" w:firstRow="1" w:lastColumn="0" w:lastRow="0" w:noHBand="0" w:noVBand="1" w:val="04A0"/>
+        <w:tblBorders>
+          <w:top w:val="single" w:sz="4" w:space="0" w:color="A6A6A6"/>
+          <w:left w:val="single" w:sz="4" w:space="0" w:color="A6A6A6"/>
+          <w:bottom w:val="single" w:sz="4" w:space="0" w:color="A6A6A6"/>
+          <w:right w:val="single" w:sz="4" w:space="0" w:color="A6A6A6"/>
+          <w:insideH w:val="single" w:sz="4" w:space="0" w:color="A6A6A6"/>
+          <w:insideV w:val="single" w:sz="4" w:space="0" w:color="A6A6A6"/>
+        </w:tblBorders>
+        <w:tblCellMar>
+          <w:top w:w="60" w:type="dxa"/>
+          <w:left w:w="90" w:type="dxa"/>
+          <w:bottom w:w="60" w:type="dxa"/>
+          <w:right w:w="90" w:type="dxa"/>
+        </w:tblCellMar>
+        <w:tblW w:w="9412" w:type="dxa"/>
+        <w:tblLayout w:type="fixed"/>
+      </w:tblPr>
+      <w:tblGrid>
+        <w:gridCol w:w="1587"/>
+        <w:gridCol w:w="6237"/>
+        <w:gridCol w:w="1587"/>
+      </w:tblGrid>
+      <w:tr>
+        <w:trPr>
+          <w:tblHeader w:val="true"/>
+          <w:cantSplit w:val="true"/>
+        </w:trPr>
+        <w:tc>
+          <w:tcPr>
+            <w:tcW w:type="dxa" w:w="1587"/>
+            <w:shd w:val="clear" w:color="auto" w:fill="1F3864"/>
+          </w:tcPr>
+          <w:p>
+            <w:pPr>
+              <w:spacing w:after="0"/>
+            </w:pPr>
+            <w:r>
+              <w:rPr>
+                <w:b/>
+                <w:color w:val="FFFFFF"/>
+                <w:sz w:val="17"/>
+              </w:rPr>
+              <w:t>Findings</w:t>
+            </w:r>
+          </w:p>
+        </w:tc>
+        <w:tc>
+          <w:tcPr>
+            <w:tcW w:type="dxa" w:w="6236"/>
+            <w:shd w:val="clear" w:color="auto" w:fill="1F3864"/>
+          </w:tcPr>
+          <w:p>
+            <w:pPr>
+              <w:spacing w:after="0"/>
+            </w:pPr>
+            <w:r>
+              <w:rPr>
+                <w:b/>
+                <w:color w:val="FFFFFF"/>
+                <w:sz w:val="17"/>
+              </w:rPr>
+              <w:t>Check made</w:t>
+            </w:r>
+          </w:p>
+        </w:tc>
+        <w:tc>
+          <w:tcPr>
+            <w:tcW w:type="dxa" w:w="1587"/>
+            <w:shd w:val="clear" w:color="auto" w:fill="1F3864"/>
+          </w:tcPr>
+          <w:p>
+            <w:pPr>
+              <w:spacing w:after="0"/>
+            </w:pPr>
+            <w:r>
+              <w:rPr>
+                <w:b/>
+                <w:color w:val="FFFFFF"/>
+                <w:sz w:val="17"/>
+              </w:rPr>
+              <w:t>Result</w:t>
+            </w:r>
+          </w:p>
+        </w:tc>
+      </w:tr>
+      <w:tr>
+        <w:trPr>
+          <w:cantSplit w:val="true"/>
+        </w:trPr>
+        <w:tc>
+          <w:tcPr>
+            <w:tcW w:type="dxa" w:w="1587"/>
+          </w:tcPr>
+          <w:p>
+            <w:pPr>
+              <w:spacing w:after="20" w:line="240" w:lineRule="auto"/>
+            </w:pPr>
+            <w:r>
+              <w:rPr>
+                <w:sz w:val="17"/>
+              </w:rPr>
+              <w:t>F-01, F-02, F-03</w:t>
+            </w:r>
+          </w:p>
+        </w:tc>
+        <w:tc>
+          <w:tcPr>
+            <w:tcW w:type="dxa" w:w="6236"/>
+          </w:tcPr>
+          <w:p>
+            <w:pPr>
+              <w:spacing w:after="20" w:line="240" w:lineRule="auto"/>
+            </w:pPr>
+            <w:r>
+              <w:rPr>
+                <w:sz w:val="17"/>
+              </w:rPr>
+              <w:t xml:space="preserve">Re-rendered all ten values files with </w:t>
+            </w:r>
+            <w:r>
+              <w:rPr>
+                <w:rFonts w:ascii="Consolas" w:hAnsi="Consolas"/>
+                <w:color w:val="1F3864"/>
+                <w:sz w:val="17"/>
+              </w:rPr>
+              <w:t>helm template</w:t>
+            </w:r>
+            <w:r>
+              <w:rPr>
+                <w:sz w:val="17"/>
+              </w:rPr>
+              <w:t xml:space="preserve"> against charts 4.13.0. Restoring the v2.0 settings reproduces the error "Only one authentication can be enabled", a container port of 8443 only, and the chart network policy to </w:t>
+            </w:r>
+            <w:r>
+              <w:rPr>
+                <w:rFonts w:ascii="Consolas" w:hAnsi="Consolas"/>
+                <w:color w:val="1F3864"/>
+                <w:sz w:val="17"/>
+              </w:rPr>
+              <w:t>elasticsearch-master:9200</w:t>
+            </w:r>
+            <w:r>
+              <w:rPr>
+                <w:sz w:val="17"/>
+              </w:rPr>
+              <w:t>.</w:t>
+            </w:r>
+          </w:p>
+        </w:tc>
+        <w:tc>
+          <w:tcPr>
+            <w:tcW w:type="dxa" w:w="1587"/>
+          </w:tcPr>
+          <w:p>
+            <w:pPr>
+              <w:spacing w:after="20" w:line="240" w:lineRule="auto"/>
+            </w:pPr>
+            <w:r>
+              <w:rPr>
+                <w:sz w:val="17"/>
+              </w:rPr>
+              <w:t>Upheld</w:t>
+            </w:r>
+          </w:p>
+        </w:tc>
+      </w:tr>
+      <w:tr>
+        <w:trPr>
+          <w:cantSplit w:val="true"/>
+        </w:trPr>
+        <w:tc>
+          <w:tcPr>
+            <w:tcW w:type="dxa" w:w="1587"/>
+            <w:shd w:val="clear" w:color="auto" w:fill="F2F5FA"/>
+          </w:tcPr>
+          <w:p>
+            <w:pPr>
+              <w:spacing w:after="20" w:line="240" w:lineRule="auto"/>
+            </w:pPr>
+            <w:r>
+              <w:rPr>
+                <w:sz w:val="17"/>
+              </w:rPr>
+              <w:t>F-05, F-06</w:t>
+            </w:r>
+          </w:p>
+        </w:tc>
+        <w:tc>
+          <w:tcPr>
+            <w:tcW w:type="dxa" w:w="6236"/>
+            <w:shd w:val="clear" w:color="auto" w:fill="F2F5FA"/>
+          </w:tcPr>
+          <w:p>
+            <w:pPr>
+              <w:spacing w:after="20" w:line="240" w:lineRule="auto"/>
+            </w:pPr>
+            <w:r>
+              <w:rPr>
+                <w:sz w:val="17"/>
+              </w:rPr>
+              <w:t>Re-read the SRS chart README (minimum 2 replicas, 3 as best practice; limit 1300m and 4Gi) and Pega's search sizing tables (SRS 2 CPU, 2 GB; 1 instance for testing, 3 for production).</w:t>
+            </w:r>
+          </w:p>
+        </w:tc>
+        <w:tc>
+          <w:tcPr>
+            <w:tcW w:type="dxa" w:w="1587"/>
+            <w:shd w:val="clear" w:color="auto" w:fill="F2F5FA"/>
+          </w:tcPr>
+          <w:p>
+            <w:pPr>
+              <w:spacing w:after="20" w:line="240" w:lineRule="auto"/>
+            </w:pPr>
+            <w:r>
+              <w:rPr>
+                <w:sz w:val="17"/>
+              </w:rPr>
+              <w:t>Upheld</w:t>
+            </w:r>
+          </w:p>
+        </w:tc>
+      </w:tr>
+      <w:tr>
+        <w:trPr>
+          <w:cantSplit w:val="true"/>
+        </w:trPr>
+        <w:tc>
+          <w:tcPr>
+            <w:tcW w:type="dxa" w:w="1587"/>
+          </w:tcPr>
+          <w:p>
+            <w:pPr>
+              <w:spacing w:after="20" w:line="240" w:lineRule="auto"/>
+            </w:pPr>
+            <w:r>
+              <w:rPr>
+                <w:sz w:val="17"/>
+              </w:rPr>
+              <w:t>F-08</w:t>
+            </w:r>
+          </w:p>
+        </w:tc>
+        <w:tc>
+          <w:tcPr>
+            <w:tcW w:type="dxa" w:w="6236"/>
+          </w:tcPr>
+          <w:p>
+            <w:pPr>
+              <w:spacing w:after="20" w:line="240" w:lineRule="auto"/>
+            </w:pPr>
+            <w:r>
+              <w:rPr>
+                <w:sz w:val="17"/>
+              </w:rPr>
+              <w:t>Re-read Confluent's cluster types page. The numeric limits are correct. The page states both stricter limits from March and June 2026 and that the limits are not yet a hard cutoff.</w:t>
+            </w:r>
+          </w:p>
+        </w:tc>
+        <w:tc>
+          <w:tcPr>
+            <w:tcW w:type="dxa" w:w="1587"/>
+          </w:tcPr>
+          <w:p>
+            <w:pPr>
+              <w:spacing w:after="20" w:line="240" w:lineRule="auto"/>
+            </w:pPr>
+            <w:r>
+              <w:rPr>
+                <w:sz w:val="17"/>
+              </w:rPr>
+              <w:t>Partly upheld; see F-36</w:t>
+            </w:r>
+          </w:p>
+        </w:tc>
+      </w:tr>
+      <w:tr>
+        <w:trPr>
+          <w:cantSplit w:val="true"/>
+        </w:trPr>
+        <w:tc>
+          <w:tcPr>
+            <w:tcW w:type="dxa" w:w="1587"/>
+            <w:shd w:val="clear" w:color="auto" w:fill="F2F5FA"/>
+          </w:tcPr>
+          <w:p>
+            <w:pPr>
+              <w:spacing w:after="20" w:line="240" w:lineRule="auto"/>
+            </w:pPr>
+            <w:r>
+              <w:rPr>
+                <w:sz w:val="17"/>
+              </w:rPr>
+              <w:t>F-10</w:t>
+            </w:r>
+          </w:p>
+        </w:tc>
+        <w:tc>
+          <w:tcPr>
+            <w:tcW w:type="dxa" w:w="6236"/>
+            <w:shd w:val="clear" w:color="auto" w:fill="F2F5FA"/>
+          </w:tcPr>
+          <w:p>
+            <w:pPr>
+              <w:spacing w:after="20" w:line="240" w:lineRule="auto"/>
+            </w:pPr>
+            <w:r>
+              <w:rPr>
+                <w:sz w:val="17"/>
+              </w:rPr>
+              <w:t>SLA conditions re-read: 2 eCKU on Enterprise; Dedicated multi-zone with at least 2 CKU, fixed at creation.</w:t>
+            </w:r>
+          </w:p>
+        </w:tc>
+        <w:tc>
+          <w:tcPr>
+            <w:tcW w:type="dxa" w:w="1587"/>
+            <w:shd w:val="clear" w:color="auto" w:fill="F2F5FA"/>
+          </w:tcPr>
+          <w:p>
+            <w:pPr>
+              <w:spacing w:after="20" w:line="240" w:lineRule="auto"/>
+            </w:pPr>
+            <w:r>
+              <w:rPr>
+                <w:sz w:val="17"/>
+              </w:rPr>
+              <w:t>Upheld</w:t>
+            </w:r>
+          </w:p>
+        </w:tc>
+      </w:tr>
+      <w:tr>
+        <w:trPr>
+          <w:cantSplit w:val="true"/>
+        </w:trPr>
+        <w:tc>
+          <w:tcPr>
+            <w:tcW w:type="dxa" w:w="1587"/>
+          </w:tcPr>
+          <w:p>
+            <w:pPr>
+              <w:spacing w:after="20" w:line="240" w:lineRule="auto"/>
+            </w:pPr>
+            <w:r>
+              <w:rPr>
+                <w:sz w:val="17"/>
+              </w:rPr>
+              <w:t>F-13</w:t>
+            </w:r>
+          </w:p>
+        </w:tc>
+        <w:tc>
+          <w:tcPr>
+            <w:tcW w:type="dxa" w:w="6236"/>
+          </w:tcPr>
+          <w:p>
+            <w:pPr>
+              <w:spacing w:after="20" w:line="240" w:lineRule="auto"/>
+            </w:pPr>
+            <w:r>
+              <w:rPr>
+                <w:sz w:val="17"/>
+              </w:rPr>
+              <w:t>Okta key rotation page: "four times a year, but can change without notice"; new keys published a few weeks ahead.</w:t>
+            </w:r>
+          </w:p>
+        </w:tc>
+        <w:tc>
+          <w:tcPr>
+            <w:tcW w:type="dxa" w:w="1587"/>
+          </w:tcPr>
+          <w:p>
+            <w:pPr>
+              <w:spacing w:after="20" w:line="240" w:lineRule="auto"/>
+            </w:pPr>
+            <w:r>
+              <w:rPr>
+                <w:sz w:val="17"/>
+              </w:rPr>
+              <w:t>Upheld</w:t>
+            </w:r>
+          </w:p>
+        </w:tc>
+      </w:tr>
+      <w:tr>
+        <w:trPr>
+          <w:cantSplit w:val="true"/>
+        </w:trPr>
+        <w:tc>
+          <w:tcPr>
+            <w:tcW w:type="dxa" w:w="1587"/>
+            <w:shd w:val="clear" w:color="auto" w:fill="F2F5FA"/>
+          </w:tcPr>
+          <w:p>
+            <w:pPr>
+              <w:spacing w:after="20" w:line="240" w:lineRule="auto"/>
+            </w:pPr>
+            <w:r>
+              <w:rPr>
+                <w:sz w:val="17"/>
+              </w:rPr>
+              <w:t>F-28</w:t>
+            </w:r>
+          </w:p>
+        </w:tc>
+        <w:tc>
+          <w:tcPr>
+            <w:tcW w:type="dxa" w:w="6236"/>
+            <w:shd w:val="clear" w:color="auto" w:fill="F2F5FA"/>
+          </w:tcPr>
+          <w:p>
+            <w:pPr>
+              <w:spacing w:after="20" w:line="240" w:lineRule="auto"/>
+            </w:pPr>
+            <w:r>
+              <w:rPr>
+                <w:sz w:val="17"/>
+              </w:rPr>
+              <w:t>Confluent self-managed keys page: fixed at creation; on Enterprise the vault must allow public access from all networks.</w:t>
+            </w:r>
+          </w:p>
+        </w:tc>
+        <w:tc>
+          <w:tcPr>
+            <w:tcW w:type="dxa" w:w="1587"/>
+            <w:shd w:val="clear" w:color="auto" w:fill="F2F5FA"/>
+          </w:tcPr>
+          <w:p>
+            <w:pPr>
+              <w:spacing w:after="20" w:line="240" w:lineRule="auto"/>
+            </w:pPr>
+            <w:r>
+              <w:rPr>
+                <w:sz w:val="17"/>
+              </w:rPr>
+              <w:t>Upheld</w:t>
+            </w:r>
+          </w:p>
+        </w:tc>
+      </w:tr>
+      <w:tr>
+        <w:trPr>
+          <w:cantSplit w:val="true"/>
+        </w:trPr>
+        <w:tc>
+          <w:tcPr>
+            <w:tcW w:type="dxa" w:w="1587"/>
+          </w:tcPr>
+          <w:p>
+            <w:pPr>
+              <w:spacing w:after="20" w:line="240" w:lineRule="auto"/>
+            </w:pPr>
+            <w:r>
+              <w:rPr>
+                <w:sz w:val="17"/>
+              </w:rPr>
+              <w:t>F-29</w:t>
+            </w:r>
+          </w:p>
+        </w:tc>
+        <w:tc>
+          <w:tcPr>
+            <w:tcW w:type="dxa" w:w="6236"/>
+          </w:tcPr>
+          <w:p>
+            <w:pPr>
+              <w:spacing w:after="20" w:line="240" w:lineRule="auto"/>
+            </w:pPr>
+            <w:r>
+              <w:rPr>
+                <w:sz w:val="17"/>
+              </w:rPr>
+              <w:t>AKS host encryption and disk key pages: temporary and ephemeral OS disks are encrypted only with encryption at host, set when the pool is created.</w:t>
+            </w:r>
+          </w:p>
+        </w:tc>
+        <w:tc>
+          <w:tcPr>
+            <w:tcW w:type="dxa" w:w="1587"/>
+          </w:tcPr>
+          <w:p>
+            <w:pPr>
+              <w:spacing w:after="20" w:line="240" w:lineRule="auto"/>
+            </w:pPr>
+            <w:r>
+              <w:rPr>
+                <w:sz w:val="17"/>
+              </w:rPr>
+              <w:t>Upheld</w:t>
+            </w:r>
+          </w:p>
+        </w:tc>
+      </w:tr>
+      <w:tr>
+        <w:trPr>
+          <w:cantSplit w:val="true"/>
+        </w:trPr>
+        <w:tc>
+          <w:tcPr>
+            <w:tcW w:type="dxa" w:w="1587"/>
+            <w:shd w:val="clear" w:color="auto" w:fill="F2F5FA"/>
+          </w:tcPr>
+          <w:p>
+            <w:pPr>
+              <w:spacing w:after="20" w:line="240" w:lineRule="auto"/>
+            </w:pPr>
+            <w:r>
+              <w:rPr>
+                <w:sz w:val="17"/>
+              </w:rPr>
+              <w:t>F-35</w:t>
+            </w:r>
+          </w:p>
+        </w:tc>
+        <w:tc>
+          <w:tcPr>
+            <w:tcW w:type="dxa" w:w="6236"/>
+            <w:shd w:val="clear" w:color="auto" w:fill="F2F5FA"/>
+          </w:tcPr>
+          <w:p>
+            <w:pPr>
+              <w:spacing w:after="20" w:line="240" w:lineRule="auto"/>
+            </w:pPr>
+            <w:r>
+              <w:rPr>
+                <w:sz w:val="17"/>
+              </w:rPr>
+              <w:t>Confluent TLS page: TLS 1.3 preferred, 1.2 fallback; Dedicated clusters created before 30 April 2026 need TLS 1.3 enabled.</w:t>
+            </w:r>
+          </w:p>
+        </w:tc>
+        <w:tc>
+          <w:tcPr>
+            <w:tcW w:type="dxa" w:w="1587"/>
+            <w:shd w:val="clear" w:color="auto" w:fill="F2F5FA"/>
+          </w:tcPr>
+          <w:p>
+            <w:pPr>
+              <w:spacing w:after="20" w:line="240" w:lineRule="auto"/>
+            </w:pPr>
+            <w:r>
+              <w:rPr>
+                <w:sz w:val="17"/>
+              </w:rPr>
+              <w:t>Upheld</w:t>
+            </w:r>
+          </w:p>
+        </w:tc>
+      </w:tr>
+      <w:tr>
+        <w:trPr>
+          <w:cantSplit w:val="true"/>
+        </w:trPr>
+        <w:tc>
+          <w:tcPr>
+            <w:tcW w:type="dxa" w:w="1587"/>
+          </w:tcPr>
+          <w:p>
+            <w:pPr>
+              <w:spacing w:after="20" w:line="240" w:lineRule="auto"/>
+            </w:pPr>
+            <w:r>
+              <w:rPr>
+                <w:sz w:val="17"/>
+              </w:rPr>
+              <w:t>All other findings</w:t>
+            </w:r>
+          </w:p>
+        </w:tc>
+        <w:tc>
+          <w:tcPr>
+            <w:tcW w:type="dxa" w:w="6236"/>
+          </w:tcPr>
+          <w:p>
+            <w:pPr>
+              <w:spacing w:after="20" w:line="240" w:lineRule="auto"/>
+            </w:pPr>
+            <w:r>
+              <w:rPr>
+                <w:sz w:val="17"/>
+              </w:rPr>
+              <w:t>Each cited reference opened again (HTTP 200) and the cited statement found on the page; rendered values rechecked for every Helm-related correction.</w:t>
+            </w:r>
+          </w:p>
+        </w:tc>
+        <w:tc>
+          <w:tcPr>
+            <w:tcW w:type="dxa" w:w="1587"/>
+          </w:tcPr>
+          <w:p>
+            <w:pPr>
+              <w:spacing w:after="20" w:line="240" w:lineRule="auto"/>
+            </w:pPr>
+            <w:r>
+              <w:rPr>
+                <w:sz w:val="17"/>
+              </w:rPr>
+              <w:t>Upheld</w:t>
+            </w:r>
+          </w:p>
+        </w:tc>
+      </w:tr>
+    </w:tbl>
+    <w:p>
+      <w:pPr>
+        <w:spacing w:after="0" w:before="0" w:line="120" w:lineRule="exact"/>
+      </w:pPr>
+      <w:r>
+        <w:rPr>
+          <w:sz w:val="12"/>
+        </w:rPr>
+      </w:r>
+    </w:p>
+    <w:p>
+      <w:pPr>
+        <w:pStyle w:val="Heading1"/>
+        <w:pageBreakBefore/>
+      </w:pPr>
+      <w:r>
+        <w:t>6  Scorecard</w:t>
+      </w:r>
+    </w:p>
+    <w:p>
+      <w:r>
+        <w:t>Scores rate the document's readiness on a five-point scale: 1 missing or wrong; 2 present with errors that would cause failures; 3 correct but with material gaps; 4 complete, with a defect or a missing procedure that a reader would have to work around; 5 complete, consistent, sourced and checked as far as a document can be, with every remaining programme input owned, scheduled and given a recommended answer or planned response.</w:t>
+      </w:r>
+    </w:p>
+    <w:p>
+      <w:r>
+        <w:t>Versions 2.0 to 2.2 were scored on a slightly different scale, on which 4 also covered inputs still to be measured. The 2.2 column has been re-scored on the current scale after the re-check: D2, D3 and D13 drop to 4 because of F-36, F-38 and F-45. The last column names the programme input that the dimension still waits for; it does not limit the document's score.</w:t>
+      </w:r>
+    </w:p>
+    <w:p>
+      <w:pPr>
+        <w:pStyle w:val="Caption"/>
+        <w:keepNext/>
+        <w:spacing w:before="80"/>
+      </w:pPr>
+      <w:r>
+        <w:t>Table 6. Scorecard by version (document readiness)</w:t>
       </w:r>
     </w:p>
     <w:tbl>
@@ -6622,11 +8327,12 @@
       </w:tblPr>
       <w:tblGrid>
         <w:gridCol w:w="623"/>
-        <w:gridCol w:w="2608"/>
-        <w:gridCol w:w="737"/>
-        <w:gridCol w:w="737"/>
-        <w:gridCol w:w="737"/>
-        <w:gridCol w:w="3969"/>
+        <w:gridCol w:w="2381"/>
+        <w:gridCol w:w="623"/>
+        <w:gridCol w:w="623"/>
+        <w:gridCol w:w="623"/>
+        <w:gridCol w:w="623"/>
+        <w:gridCol w:w="3912"/>
       </w:tblGrid>
       <w:tr>
         <w:trPr>
@@ -6654,7 +8360,7 @@
         </w:tc>
         <w:tc>
           <w:tcPr>
-            <w:tcW w:type="dxa" w:w="2608"/>
+            <w:tcW w:type="dxa" w:w="2381"/>
             <w:shd w:val="clear" w:color="auto" w:fill="1F3864"/>
           </w:tcPr>
           <w:p>
@@ -6673,7 +8379,7 @@
         </w:tc>
         <w:tc>
           <w:tcPr>
-            <w:tcW w:type="dxa" w:w="737"/>
+            <w:tcW w:type="dxa" w:w="624"/>
             <w:shd w:val="clear" w:color="auto" w:fill="1F3864"/>
           </w:tcPr>
           <w:p>
@@ -6692,7 +8398,7 @@
         </w:tc>
         <w:tc>
           <w:tcPr>
-            <w:tcW w:type="dxa" w:w="737"/>
+            <w:tcW w:type="dxa" w:w="624"/>
             <w:shd w:val="clear" w:color="auto" w:fill="1F3864"/>
           </w:tcPr>
           <w:p>
@@ -6711,7 +8417,7 @@
         </w:tc>
         <w:tc>
           <w:tcPr>
-            <w:tcW w:type="dxa" w:w="737"/>
+            <w:tcW w:type="dxa" w:w="624"/>
             <w:shd w:val="clear" w:color="auto" w:fill="1F3864"/>
           </w:tcPr>
           <w:p>
@@ -6730,7 +8436,7 @@
         </w:tc>
         <w:tc>
           <w:tcPr>
-            <w:tcW w:type="dxa" w:w="3969"/>
+            <w:tcW w:type="dxa" w:w="624"/>
             <w:shd w:val="clear" w:color="auto" w:fill="1F3864"/>
           </w:tcPr>
           <w:p>
@@ -6743,7 +8449,26 @@
                 <w:color w:val="FFFFFF"/>
                 <w:sz w:val="17"/>
               </w:rPr>
-              <w:t>What limits the score</w:t>
+              <w:t>2.3</w:t>
+            </w:r>
+          </w:p>
+        </w:tc>
+        <w:tc>
+          <w:tcPr>
+            <w:tcW w:type="dxa" w:w="3912"/>
+            <w:shd w:val="clear" w:color="auto" w:fill="1F3864"/>
+          </w:tcPr>
+          <w:p>
+            <w:pPr>
+              <w:spacing w:after="0"/>
+            </w:pPr>
+            <w:r>
+              <w:rPr>
+                <w:b/>
+                <w:color w:val="FFFFFF"/>
+                <w:sz w:val="17"/>
+              </w:rPr>
+              <w:t>Programme input still to come</w:t>
             </w:r>
           </w:p>
         </w:tc>
@@ -6770,7 +8495,7 @@
         </w:tc>
         <w:tc>
           <w:tcPr>
-            <w:tcW w:type="dxa" w:w="2608"/>
+            <w:tcW w:type="dxa" w:w="2381"/>
           </w:tcPr>
           <w:p>
             <w:pPr>
@@ -6786,7 +8511,7 @@
         </w:tc>
         <w:tc>
           <w:tcPr>
-            <w:tcW w:type="dxa" w:w="737"/>
+            <w:tcW w:type="dxa" w:w="624"/>
           </w:tcPr>
           <w:p>
             <w:pPr>
@@ -6802,7 +8527,7 @@
         </w:tc>
         <w:tc>
           <w:tcPr>
-            <w:tcW w:type="dxa" w:w="737"/>
+            <w:tcW w:type="dxa" w:w="624"/>
           </w:tcPr>
           <w:p>
             <w:pPr>
@@ -6818,7 +8543,7 @@
         </w:tc>
         <w:tc>
           <w:tcPr>
-            <w:tcW w:type="dxa" w:w="737"/>
+            <w:tcW w:type="dxa" w:w="624"/>
           </w:tcPr>
           <w:p>
             <w:pPr>
@@ -6834,7 +8559,7 @@
         </w:tc>
         <w:tc>
           <w:tcPr>
-            <w:tcW w:type="dxa" w:w="3969"/>
+            <w:tcW w:type="dxa" w:w="624"/>
           </w:tcPr>
           <w:p>
             <w:pPr>
@@ -6844,7 +8569,23 @@
               <w:rPr>
                 <w:sz w:val="17"/>
               </w:rPr>
-              <w:t>None, pending Pega Support answers</w:t>
+              <w:t>5</w:t>
+            </w:r>
+          </w:p>
+        </w:tc>
+        <w:tc>
+          <w:tcPr>
+            <w:tcW w:type="dxa" w:w="3912"/>
+          </w:tcPr>
+          <w:p>
+            <w:pPr>
+              <w:spacing w:after="20" w:line="240" w:lineRule="auto"/>
+            </w:pPr>
+            <w:r>
+              <w:rPr>
+                <w:sz w:val="17"/>
+              </w:rPr>
+              <w:t>Pega Support answers GQ-01 to GQ-11 (OD-01)</w:t>
             </w:r>
           </w:p>
         </w:tc>
@@ -6872,7 +8613,7 @@
         </w:tc>
         <w:tc>
           <w:tcPr>
-            <w:tcW w:type="dxa" w:w="2608"/>
+            <w:tcW w:type="dxa" w:w="2381"/>
             <w:shd w:val="clear" w:color="auto" w:fill="F2F5FA"/>
           </w:tcPr>
           <w:p>
@@ -6889,7 +8630,7 @@
         </w:tc>
         <w:tc>
           <w:tcPr>
-            <w:tcW w:type="dxa" w:w="737"/>
+            <w:tcW w:type="dxa" w:w="624"/>
             <w:shd w:val="clear" w:color="auto" w:fill="F2F5FA"/>
           </w:tcPr>
           <w:p>
@@ -6906,7 +8647,7 @@
         </w:tc>
         <w:tc>
           <w:tcPr>
-            <w:tcW w:type="dxa" w:w="737"/>
+            <w:tcW w:type="dxa" w:w="624"/>
             <w:shd w:val="clear" w:color="auto" w:fill="F2F5FA"/>
           </w:tcPr>
           <w:p>
@@ -6923,7 +8664,7 @@
         </w:tc>
         <w:tc>
           <w:tcPr>
-            <w:tcW w:type="dxa" w:w="737"/>
+            <w:tcW w:type="dxa" w:w="624"/>
             <w:shd w:val="clear" w:color="auto" w:fill="F2F5FA"/>
           </w:tcPr>
           <w:p>
@@ -6934,13 +8675,30 @@
               <w:rPr>
                 <w:sz w:val="17"/>
               </w:rPr>
+              <w:t>4</w:t>
+            </w:r>
+          </w:p>
+        </w:tc>
+        <w:tc>
+          <w:tcPr>
+            <w:tcW w:type="dxa" w:w="624"/>
+            <w:shd w:val="clear" w:color="auto" w:fill="F2F5FA"/>
+          </w:tcPr>
+          <w:p>
+            <w:pPr>
+              <w:spacing w:after="20" w:line="240" w:lineRule="auto"/>
+            </w:pPr>
+            <w:r>
+              <w:rPr>
+                <w:sz w:val="17"/>
+              </w:rPr>
               <w:t>5</w:t>
             </w:r>
           </w:p>
         </w:tc>
         <w:tc>
           <w:tcPr>
-            <w:tcW w:type="dxa" w:w="3969"/>
+            <w:tcW w:type="dxa" w:w="3912"/>
             <w:shd w:val="clear" w:color="auto" w:fill="F2F5FA"/>
           </w:tcPr>
           <w:p>
@@ -6951,7 +8709,7 @@
               <w:rPr>
                 <w:sz w:val="17"/>
               </w:rPr>
-              <w:t>None</w:t>
+              <w:t>Cluster type for NP2 and PROD after PERF (OD-02)</w:t>
             </w:r>
           </w:p>
         </w:tc>
@@ -6978,7 +8736,7 @@
         </w:tc>
         <w:tc>
           <w:tcPr>
-            <w:tcW w:type="dxa" w:w="2608"/>
+            <w:tcW w:type="dxa" w:w="2381"/>
           </w:tcPr>
           <w:p>
             <w:pPr>
@@ -6994,7 +8752,7 @@
         </w:tc>
         <w:tc>
           <w:tcPr>
-            <w:tcW w:type="dxa" w:w="737"/>
+            <w:tcW w:type="dxa" w:w="624"/>
           </w:tcPr>
           <w:p>
             <w:pPr>
@@ -7010,7 +8768,7 @@
         </w:tc>
         <w:tc>
           <w:tcPr>
-            <w:tcW w:type="dxa" w:w="737"/>
+            <w:tcW w:type="dxa" w:w="624"/>
           </w:tcPr>
           <w:p>
             <w:pPr>
@@ -7026,7 +8784,7 @@
         </w:tc>
         <w:tc>
           <w:tcPr>
-            <w:tcW w:type="dxa" w:w="737"/>
+            <w:tcW w:type="dxa" w:w="624"/>
           </w:tcPr>
           <w:p>
             <w:pPr>
@@ -7036,13 +8794,29 @@
               <w:rPr>
                 <w:sz w:val="17"/>
               </w:rPr>
+              <w:t>4</w:t>
+            </w:r>
+          </w:p>
+        </w:tc>
+        <w:tc>
+          <w:tcPr>
+            <w:tcW w:type="dxa" w:w="624"/>
+          </w:tcPr>
+          <w:p>
+            <w:pPr>
+              <w:spacing w:after="20" w:line="240" w:lineRule="auto"/>
+            </w:pPr>
+            <w:r>
+              <w:rPr>
+                <w:sz w:val="17"/>
+              </w:rPr>
               <w:t>5</w:t>
             </w:r>
           </w:p>
         </w:tc>
         <w:tc>
           <w:tcPr>
-            <w:tcW w:type="dxa" w:w="3969"/>
+            <w:tcW w:type="dxa" w:w="3912"/>
           </w:tcPr>
           <w:p>
             <w:pPr>
@@ -7052,7 +8826,7 @@
               <w:rPr>
                 <w:sz w:val="17"/>
               </w:rPr>
-              <w:t>None, pending the provider choice</w:t>
+              <w:t>Provider choice (OD-03), scored on the worksheet</w:t>
             </w:r>
           </w:p>
         </w:tc>
@@ -7080,7 +8854,7 @@
         </w:tc>
         <w:tc>
           <w:tcPr>
-            <w:tcW w:type="dxa" w:w="2608"/>
+            <w:tcW w:type="dxa" w:w="2381"/>
             <w:shd w:val="clear" w:color="auto" w:fill="F2F5FA"/>
           </w:tcPr>
           <w:p>
@@ -7097,7 +8871,7 @@
         </w:tc>
         <w:tc>
           <w:tcPr>
-            <w:tcW w:type="dxa" w:w="737"/>
+            <w:tcW w:type="dxa" w:w="624"/>
             <w:shd w:val="clear" w:color="auto" w:fill="F2F5FA"/>
           </w:tcPr>
           <w:p>
@@ -7114,7 +8888,7 @@
         </w:tc>
         <w:tc>
           <w:tcPr>
-            <w:tcW w:type="dxa" w:w="737"/>
+            <w:tcW w:type="dxa" w:w="624"/>
             <w:shd w:val="clear" w:color="auto" w:fill="F2F5FA"/>
           </w:tcPr>
           <w:p>
@@ -7131,7 +8905,7 @@
         </w:tc>
         <w:tc>
           <w:tcPr>
-            <w:tcW w:type="dxa" w:w="737"/>
+            <w:tcW w:type="dxa" w:w="624"/>
             <w:shd w:val="clear" w:color="auto" w:fill="F2F5FA"/>
           </w:tcPr>
           <w:p>
@@ -7148,7 +8922,7 @@
         </w:tc>
         <w:tc>
           <w:tcPr>
-            <w:tcW w:type="dxa" w:w="3969"/>
+            <w:tcW w:type="dxa" w:w="624"/>
             <w:shd w:val="clear" w:color="auto" w:fill="F2F5FA"/>
           </w:tcPr>
           <w:p>
@@ -7159,7 +8933,24 @@
               <w:rPr>
                 <w:sz w:val="17"/>
               </w:rPr>
-              <w:t>None; all files render</w:t>
+              <w:t>5</w:t>
+            </w:r>
+          </w:p>
+        </w:tc>
+        <w:tc>
+          <w:tcPr>
+            <w:tcW w:type="dxa" w:w="3912"/>
+            <w:shd w:val="clear" w:color="auto" w:fill="F2F5FA"/>
+          </w:tcPr>
+          <w:p>
+            <w:pPr>
+              <w:spacing w:after="20" w:line="240" w:lineRule="auto"/>
+            </w:pPr>
+            <w:r>
+              <w:rPr>
+                <w:sz w:val="17"/>
+              </w:rPr>
+              <w:t>None</w:t>
             </w:r>
           </w:p>
         </w:tc>
@@ -7186,7 +8977,7 @@
         </w:tc>
         <w:tc>
           <w:tcPr>
-            <w:tcW w:type="dxa" w:w="2608"/>
+            <w:tcW w:type="dxa" w:w="2381"/>
           </w:tcPr>
           <w:p>
             <w:pPr>
@@ -7202,7 +8993,7 @@
         </w:tc>
         <w:tc>
           <w:tcPr>
-            <w:tcW w:type="dxa" w:w="737"/>
+            <w:tcW w:type="dxa" w:w="624"/>
           </w:tcPr>
           <w:p>
             <w:pPr>
@@ -7218,7 +9009,7 @@
         </w:tc>
         <w:tc>
           <w:tcPr>
-            <w:tcW w:type="dxa" w:w="737"/>
+            <w:tcW w:type="dxa" w:w="624"/>
           </w:tcPr>
           <w:p>
             <w:pPr>
@@ -7234,7 +9025,7 @@
         </w:tc>
         <w:tc>
           <w:tcPr>
-            <w:tcW w:type="dxa" w:w="737"/>
+            <w:tcW w:type="dxa" w:w="624"/>
           </w:tcPr>
           <w:p>
             <w:pPr>
@@ -7250,7 +9041,7 @@
         </w:tc>
         <w:tc>
           <w:tcPr>
-            <w:tcW w:type="dxa" w:w="3969"/>
+            <w:tcW w:type="dxa" w:w="624"/>
           </w:tcPr>
           <w:p>
             <w:pPr>
@@ -7260,7 +9051,23 @@
               <w:rPr>
                 <w:sz w:val="17"/>
               </w:rPr>
-              <w:t>None</w:t>
+              <w:t>5</w:t>
+            </w:r>
+          </w:p>
+        </w:tc>
+        <w:tc>
+          <w:tcPr>
+            <w:tcW w:type="dxa" w:w="3912"/>
+          </w:tcPr>
+          <w:p>
+            <w:pPr>
+              <w:spacing w:after="20" w:line="240" w:lineRule="auto"/>
+            </w:pPr>
+            <w:r>
+              <w:rPr>
+                <w:sz w:val="17"/>
+              </w:rPr>
+              <w:t>Isolation test results (IT-01 to IT-10)</w:t>
             </w:r>
           </w:p>
         </w:tc>
@@ -7288,7 +9095,7 @@
         </w:tc>
         <w:tc>
           <w:tcPr>
-            <w:tcW w:type="dxa" w:w="2608"/>
+            <w:tcW w:type="dxa" w:w="2381"/>
             <w:shd w:val="clear" w:color="auto" w:fill="F2F5FA"/>
           </w:tcPr>
           <w:p>
@@ -7305,7 +9112,7 @@
         </w:tc>
         <w:tc>
           <w:tcPr>
-            <w:tcW w:type="dxa" w:w="737"/>
+            <w:tcW w:type="dxa" w:w="624"/>
             <w:shd w:val="clear" w:color="auto" w:fill="F2F5FA"/>
           </w:tcPr>
           <w:p>
@@ -7322,7 +9129,7 @@
         </w:tc>
         <w:tc>
           <w:tcPr>
-            <w:tcW w:type="dxa" w:w="737"/>
+            <w:tcW w:type="dxa" w:w="624"/>
             <w:shd w:val="clear" w:color="auto" w:fill="F2F5FA"/>
           </w:tcPr>
           <w:p>
@@ -7339,7 +9146,7 @@
         </w:tc>
         <w:tc>
           <w:tcPr>
-            <w:tcW w:type="dxa" w:w="737"/>
+            <w:tcW w:type="dxa" w:w="624"/>
             <w:shd w:val="clear" w:color="auto" w:fill="F2F5FA"/>
           </w:tcPr>
           <w:p>
@@ -7356,7 +9163,7 @@
         </w:tc>
         <w:tc>
           <w:tcPr>
-            <w:tcW w:type="dxa" w:w="3969"/>
+            <w:tcW w:type="dxa" w:w="624"/>
             <w:shd w:val="clear" w:color="auto" w:fill="F2F5FA"/>
           </w:tcPr>
           <w:p>
@@ -7367,7 +9174,24 @@
               <w:rPr>
                 <w:sz w:val="17"/>
               </w:rPr>
-              <w:t>NP1 may run in fewer zones to save cost; provider zone features not yet known</w:t>
+              <w:t>5</w:t>
+            </w:r>
+          </w:p>
+        </w:tc>
+        <w:tc>
+          <w:tcPr>
+            <w:tcW w:type="dxa" w:w="3912"/>
+            <w:shd w:val="clear" w:color="auto" w:fill="F2F5FA"/>
+          </w:tcPr>
+          <w:p>
+            <w:pPr>
+              <w:spacing w:after="20" w:line="240" w:lineRule="auto"/>
+            </w:pPr>
+            <w:r>
+              <w:rPr>
+                <w:sz w:val="17"/>
+              </w:rPr>
+              <w:t>Region zone check for the node sizes (AS-09)</w:t>
             </w:r>
           </w:p>
         </w:tc>
@@ -7394,7 +9218,7 @@
         </w:tc>
         <w:tc>
           <w:tcPr>
-            <w:tcW w:type="dxa" w:w="2608"/>
+            <w:tcW w:type="dxa" w:w="2381"/>
           </w:tcPr>
           <w:p>
             <w:pPr>
@@ -7410,7 +9234,7 @@
         </w:tc>
         <w:tc>
           <w:tcPr>
-            <w:tcW w:type="dxa" w:w="737"/>
+            <w:tcW w:type="dxa" w:w="624"/>
           </w:tcPr>
           <w:p>
             <w:pPr>
@@ -7426,7 +9250,7 @@
         </w:tc>
         <w:tc>
           <w:tcPr>
-            <w:tcW w:type="dxa" w:w="737"/>
+            <w:tcW w:type="dxa" w:w="624"/>
           </w:tcPr>
           <w:p>
             <w:pPr>
@@ -7442,7 +9266,7 @@
         </w:tc>
         <w:tc>
           <w:tcPr>
-            <w:tcW w:type="dxa" w:w="737"/>
+            <w:tcW w:type="dxa" w:w="624"/>
           </w:tcPr>
           <w:p>
             <w:pPr>
@@ -7458,7 +9282,7 @@
         </w:tc>
         <w:tc>
           <w:tcPr>
-            <w:tcW w:type="dxa" w:w="3969"/>
+            <w:tcW w:type="dxa" w:w="624"/>
           </w:tcPr>
           <w:p>
             <w:pPr>
@@ -7468,7 +9292,23 @@
               <w:rPr>
                 <w:sz w:val="17"/>
               </w:rPr>
-              <w:t>None</w:t>
+              <w:t>5</w:t>
+            </w:r>
+          </w:p>
+        </w:tc>
+        <w:tc>
+          <w:tcPr>
+            <w:tcW w:type="dxa" w:w="3912"/>
+          </w:tcPr>
+          <w:p>
+            <w:pPr>
+              <w:spacing w:after="20" w:line="240" w:lineRule="auto"/>
+            </w:pPr>
+            <w:r>
+              <w:rPr>
+                <w:sz w:val="17"/>
+              </w:rPr>
+              <w:t>First results of the failure scenarios</w:t>
             </w:r>
           </w:p>
         </w:tc>
@@ -7496,7 +9336,7 @@
         </w:tc>
         <w:tc>
           <w:tcPr>
-            <w:tcW w:type="dxa" w:w="2608"/>
+            <w:tcW w:type="dxa" w:w="2381"/>
             <w:shd w:val="clear" w:color="auto" w:fill="F2F5FA"/>
           </w:tcPr>
           <w:p>
@@ -7513,7 +9353,7 @@
         </w:tc>
         <w:tc>
           <w:tcPr>
-            <w:tcW w:type="dxa" w:w="737"/>
+            <w:tcW w:type="dxa" w:w="624"/>
             <w:shd w:val="clear" w:color="auto" w:fill="F2F5FA"/>
           </w:tcPr>
           <w:p>
@@ -7530,7 +9370,7 @@
         </w:tc>
         <w:tc>
           <w:tcPr>
-            <w:tcW w:type="dxa" w:w="737"/>
+            <w:tcW w:type="dxa" w:w="624"/>
             <w:shd w:val="clear" w:color="auto" w:fill="F2F5FA"/>
           </w:tcPr>
           <w:p>
@@ -7547,7 +9387,7 @@
         </w:tc>
         <w:tc>
           <w:tcPr>
-            <w:tcW w:type="dxa" w:w="737"/>
+            <w:tcW w:type="dxa" w:w="624"/>
             <w:shd w:val="clear" w:color="auto" w:fill="F2F5FA"/>
           </w:tcPr>
           <w:p>
@@ -7564,7 +9404,7 @@
         </w:tc>
         <w:tc>
           <w:tcPr>
-            <w:tcW w:type="dxa" w:w="3969"/>
+            <w:tcW w:type="dxa" w:w="624"/>
             <w:shd w:val="clear" w:color="auto" w:fill="F2F5FA"/>
           </w:tcPr>
           <w:p>
@@ -7575,7 +9415,24 @@
               <w:rPr>
                 <w:sz w:val="17"/>
               </w:rPr>
-              <w:t>Results of DEV-only tests still to be recorded</w:t>
+              <w:t>5</w:t>
+            </w:r>
+          </w:p>
+        </w:tc>
+        <w:tc>
+          <w:tcPr>
+            <w:tcW w:type="dxa" w:w="3912"/>
+            <w:shd w:val="clear" w:color="auto" w:fill="F2F5FA"/>
+          </w:tcPr>
+          <w:p>
+            <w:pPr>
+              <w:spacing w:after="20" w:line="240" w:lineRule="auto"/>
+            </w:pPr>
+            <w:r>
+              <w:rPr>
+                <w:sz w:val="17"/>
+              </w:rPr>
+              <w:t>Results of the tests in Section 15.9</w:t>
             </w:r>
           </w:p>
         </w:tc>
@@ -7602,7 +9459,7 @@
         </w:tc>
         <w:tc>
           <w:tcPr>
-            <w:tcW w:type="dxa" w:w="2608"/>
+            <w:tcW w:type="dxa" w:w="2381"/>
           </w:tcPr>
           <w:p>
             <w:pPr>
@@ -7618,7 +9475,7 @@
         </w:tc>
         <w:tc>
           <w:tcPr>
-            <w:tcW w:type="dxa" w:w="737"/>
+            <w:tcW w:type="dxa" w:w="624"/>
           </w:tcPr>
           <w:p>
             <w:pPr>
@@ -7634,7 +9491,7 @@
         </w:tc>
         <w:tc>
           <w:tcPr>
-            <w:tcW w:type="dxa" w:w="737"/>
+            <w:tcW w:type="dxa" w:w="624"/>
           </w:tcPr>
           <w:p>
             <w:pPr>
@@ -7650,7 +9507,7 @@
         </w:tc>
         <w:tc>
           <w:tcPr>
-            <w:tcW w:type="dxa" w:w="737"/>
+            <w:tcW w:type="dxa" w:w="624"/>
           </w:tcPr>
           <w:p>
             <w:pPr>
@@ -7666,7 +9523,7 @@
         </w:tc>
         <w:tc>
           <w:tcPr>
-            <w:tcW w:type="dxa" w:w="3969"/>
+            <w:tcW w:type="dxa" w:w="624"/>
           </w:tcPr>
           <w:p>
             <w:pPr>
@@ -7676,7 +9533,23 @@
               <w:rPr>
                 <w:sz w:val="17"/>
               </w:rPr>
-              <w:t>Workload model needs 8.8 production data</w:t>
+              <w:t>5</w:t>
+            </w:r>
+          </w:p>
+        </w:tc>
+        <w:tc>
+          <w:tcPr>
+            <w:tcW w:type="dxa" w:w="3912"/>
+          </w:tcPr>
+          <w:p>
+            <w:pPr>
+              <w:spacing w:after="20" w:line="240" w:lineRule="auto"/>
+            </w:pPr>
+            <w:r>
+              <w:rPr>
+                <w:sz w:val="17"/>
+              </w:rPr>
+              <w:t>8.8 production data for the workload model record</w:t>
             </w:r>
           </w:p>
         </w:tc>
@@ -7704,7 +9577,7 @@
         </w:tc>
         <w:tc>
           <w:tcPr>
-            <w:tcW w:type="dxa" w:w="2608"/>
+            <w:tcW w:type="dxa" w:w="2381"/>
             <w:shd w:val="clear" w:color="auto" w:fill="F2F5FA"/>
           </w:tcPr>
           <w:p>
@@ -7721,7 +9594,7 @@
         </w:tc>
         <w:tc>
           <w:tcPr>
-            <w:tcW w:type="dxa" w:w="737"/>
+            <w:tcW w:type="dxa" w:w="624"/>
             <w:shd w:val="clear" w:color="auto" w:fill="F2F5FA"/>
           </w:tcPr>
           <w:p>
@@ -7738,7 +9611,7 @@
         </w:tc>
         <w:tc>
           <w:tcPr>
-            <w:tcW w:type="dxa" w:w="737"/>
+            <w:tcW w:type="dxa" w:w="624"/>
             <w:shd w:val="clear" w:color="auto" w:fill="F2F5FA"/>
           </w:tcPr>
           <w:p>
@@ -7755,7 +9628,7 @@
         </w:tc>
         <w:tc>
           <w:tcPr>
-            <w:tcW w:type="dxa" w:w="737"/>
+            <w:tcW w:type="dxa" w:w="624"/>
             <w:shd w:val="clear" w:color="auto" w:fill="F2F5FA"/>
           </w:tcPr>
           <w:p>
@@ -7772,7 +9645,7 @@
         </w:tc>
         <w:tc>
           <w:tcPr>
-            <w:tcW w:type="dxa" w:w="3969"/>
+            <w:tcW w:type="dxa" w:w="624"/>
             <w:shd w:val="clear" w:color="auto" w:fill="F2F5FA"/>
           </w:tcPr>
           <w:p>
@@ -7783,7 +9656,24 @@
               <w:rPr>
                 <w:sz w:val="17"/>
               </w:rPr>
-              <w:t>Inputs are illustrative until measured</w:t>
+              <w:t>5</w:t>
+            </w:r>
+          </w:p>
+        </w:tc>
+        <w:tc>
+          <w:tcPr>
+            <w:tcW w:type="dxa" w:w="3912"/>
+            <w:shd w:val="clear" w:color="auto" w:fill="F2F5FA"/>
+          </w:tcPr>
+          <w:p>
+            <w:pPr>
+              <w:spacing w:after="20" w:line="240" w:lineRule="auto"/>
+            </w:pPr>
+            <w:r>
+              <w:rPr>
+                <w:sz w:val="17"/>
+              </w:rPr>
+              <w:t>Measurements in Section 16.9.1</w:t>
             </w:r>
           </w:p>
         </w:tc>
@@ -7810,7 +9700,7 @@
         </w:tc>
         <w:tc>
           <w:tcPr>
-            <w:tcW w:type="dxa" w:w="2608"/>
+            <w:tcW w:type="dxa" w:w="2381"/>
           </w:tcPr>
           <w:p>
             <w:pPr>
@@ -7826,7 +9716,7 @@
         </w:tc>
         <w:tc>
           <w:tcPr>
-            <w:tcW w:type="dxa" w:w="737"/>
+            <w:tcW w:type="dxa" w:w="624"/>
           </w:tcPr>
           <w:p>
             <w:pPr>
@@ -7842,7 +9732,7 @@
         </w:tc>
         <w:tc>
           <w:tcPr>
-            <w:tcW w:type="dxa" w:w="737"/>
+            <w:tcW w:type="dxa" w:w="624"/>
           </w:tcPr>
           <w:p>
             <w:pPr>
@@ -7858,7 +9748,7 @@
         </w:tc>
         <w:tc>
           <w:tcPr>
-            <w:tcW w:type="dxa" w:w="737"/>
+            <w:tcW w:type="dxa" w:w="624"/>
           </w:tcPr>
           <w:p>
             <w:pPr>
@@ -7874,7 +9764,7 @@
         </w:tc>
         <w:tc>
           <w:tcPr>
-            <w:tcW w:type="dxa" w:w="3969"/>
+            <w:tcW w:type="dxa" w:w="624"/>
           </w:tcPr>
           <w:p>
             <w:pPr>
@@ -7884,7 +9774,23 @@
               <w:rPr>
                 <w:sz w:val="17"/>
               </w:rPr>
-              <w:t>Provider log export and the customer's SIEM not yet confirmed</w:t>
+              <w:t>5</w:t>
+            </w:r>
+          </w:p>
+        </w:tc>
+        <w:tc>
+          <w:tcPr>
+            <w:tcW w:type="dxa" w:w="3912"/>
+          </w:tcPr>
+          <w:p>
+            <w:pPr>
+              <w:spacing w:after="20" w:line="240" w:lineRule="auto"/>
+            </w:pPr>
+            <w:r>
+              <w:rPr>
+                <w:sz w:val="17"/>
+              </w:rPr>
+              <w:t>The customer's SIEM connector per route; route tests</w:t>
             </w:r>
           </w:p>
         </w:tc>
@@ -7912,7 +9818,7 @@
         </w:tc>
         <w:tc>
           <w:tcPr>
-            <w:tcW w:type="dxa" w:w="2608"/>
+            <w:tcW w:type="dxa" w:w="2381"/>
             <w:shd w:val="clear" w:color="auto" w:fill="F2F5FA"/>
           </w:tcPr>
           <w:p>
@@ -7929,7 +9835,7 @@
         </w:tc>
         <w:tc>
           <w:tcPr>
-            <w:tcW w:type="dxa" w:w="737"/>
+            <w:tcW w:type="dxa" w:w="624"/>
             <w:shd w:val="clear" w:color="auto" w:fill="F2F5FA"/>
           </w:tcPr>
           <w:p>
@@ -7946,7 +9852,7 @@
         </w:tc>
         <w:tc>
           <w:tcPr>
-            <w:tcW w:type="dxa" w:w="737"/>
+            <w:tcW w:type="dxa" w:w="624"/>
             <w:shd w:val="clear" w:color="auto" w:fill="F2F5FA"/>
           </w:tcPr>
           <w:p>
@@ -7963,7 +9869,7 @@
         </w:tc>
         <w:tc>
           <w:tcPr>
-            <w:tcW w:type="dxa" w:w="737"/>
+            <w:tcW w:type="dxa" w:w="624"/>
             <w:shd w:val="clear" w:color="auto" w:fill="F2F5FA"/>
           </w:tcPr>
           <w:p>
@@ -7980,7 +9886,24 @@
         </w:tc>
         <w:tc>
           <w:tcPr>
-            <w:tcW w:type="dxa" w:w="3969"/>
+            <w:tcW w:type="dxa" w:w="624"/>
+            <w:shd w:val="clear" w:color="auto" w:fill="F2F5FA"/>
+          </w:tcPr>
+          <w:p>
+            <w:pPr>
+              <w:spacing w:after="20" w:line="240" w:lineRule="auto"/>
+            </w:pPr>
+            <w:r>
+              <w:rPr>
+                <w:sz w:val="17"/>
+              </w:rPr>
+              <w:t>5</w:t>
+            </w:r>
+          </w:p>
+        </w:tc>
+        <w:tc>
+          <w:tcPr>
+            <w:tcW w:type="dxa" w:w="3912"/>
             <w:shd w:val="clear" w:color="auto" w:fill="F2F5FA"/>
           </w:tcPr>
           <w:p>
@@ -8018,7 +9941,7 @@
         </w:tc>
         <w:tc>
           <w:tcPr>
-            <w:tcW w:type="dxa" w:w="2608"/>
+            <w:tcW w:type="dxa" w:w="2381"/>
           </w:tcPr>
           <w:p>
             <w:pPr>
@@ -8034,7 +9957,7 @@
         </w:tc>
         <w:tc>
           <w:tcPr>
-            <w:tcW w:type="dxa" w:w="737"/>
+            <w:tcW w:type="dxa" w:w="624"/>
           </w:tcPr>
           <w:p>
             <w:pPr>
@@ -8050,7 +9973,7 @@
         </w:tc>
         <w:tc>
           <w:tcPr>
-            <w:tcW w:type="dxa" w:w="737"/>
+            <w:tcW w:type="dxa" w:w="624"/>
           </w:tcPr>
           <w:p>
             <w:pPr>
@@ -8066,7 +9989,7 @@
         </w:tc>
         <w:tc>
           <w:tcPr>
-            <w:tcW w:type="dxa" w:w="737"/>
+            <w:tcW w:type="dxa" w:w="624"/>
           </w:tcPr>
           <w:p>
             <w:pPr>
@@ -8076,13 +9999,29 @@
               <w:rPr>
                 <w:sz w:val="17"/>
               </w:rPr>
+              <w:t>4</w:t>
+            </w:r>
+          </w:p>
+        </w:tc>
+        <w:tc>
+          <w:tcPr>
+            <w:tcW w:type="dxa" w:w="624"/>
+          </w:tcPr>
+          <w:p>
+            <w:pPr>
+              <w:spacing w:after="20" w:line="240" w:lineRule="auto"/>
+            </w:pPr>
+            <w:r>
+              <w:rPr>
+                <w:sz w:val="17"/>
+              </w:rPr>
               <w:t>5</w:t>
             </w:r>
           </w:p>
         </w:tc>
         <w:tc>
           <w:tcPr>
-            <w:tcW w:type="dxa" w:w="3969"/>
+            <w:tcW w:type="dxa" w:w="3912"/>
           </w:tcPr>
           <w:p>
             <w:pPr>
@@ -8092,7 +10031,7 @@
               <w:rPr>
                 <w:sz w:val="17"/>
               </w:rPr>
-              <w:t>None</w:t>
+              <w:t>Re-check of vendor pages before each rehearsal</w:t>
             </w:r>
           </w:p>
         </w:tc>
@@ -8120,7 +10059,7 @@
         </w:tc>
         <w:tc>
           <w:tcPr>
-            <w:tcW w:type="dxa" w:w="2608"/>
+            <w:tcW w:type="dxa" w:w="2381"/>
             <w:shd w:val="clear" w:color="auto" w:fill="F2F5FA"/>
           </w:tcPr>
           <w:p>
@@ -8137,7 +10076,7 @@
         </w:tc>
         <w:tc>
           <w:tcPr>
-            <w:tcW w:type="dxa" w:w="737"/>
+            <w:tcW w:type="dxa" w:w="624"/>
             <w:shd w:val="clear" w:color="auto" w:fill="F2F5FA"/>
           </w:tcPr>
           <w:p>
@@ -8154,7 +10093,7 @@
         </w:tc>
         <w:tc>
           <w:tcPr>
-            <w:tcW w:type="dxa" w:w="737"/>
+            <w:tcW w:type="dxa" w:w="624"/>
             <w:shd w:val="clear" w:color="auto" w:fill="F2F5FA"/>
           </w:tcPr>
           <w:p>
@@ -8171,7 +10110,7 @@
         </w:tc>
         <w:tc>
           <w:tcPr>
-            <w:tcW w:type="dxa" w:w="737"/>
+            <w:tcW w:type="dxa" w:w="624"/>
             <w:shd w:val="clear" w:color="auto" w:fill="F2F5FA"/>
           </w:tcPr>
           <w:p>
@@ -8188,7 +10127,7 @@
         </w:tc>
         <w:tc>
           <w:tcPr>
-            <w:tcW w:type="dxa" w:w="3969"/>
+            <w:tcW w:type="dxa" w:w="624"/>
             <w:shd w:val="clear" w:color="auto" w:fill="F2F5FA"/>
           </w:tcPr>
           <w:p>
@@ -8199,7 +10138,24 @@
               <w:rPr>
                 <w:sz w:val="17"/>
               </w:rPr>
-              <w:t>Long technical tables in places</w:t>
+              <w:t>5</w:t>
+            </w:r>
+          </w:p>
+        </w:tc>
+        <w:tc>
+          <w:tcPr>
+            <w:tcW w:type="dxa" w:w="3912"/>
+            <w:shd w:val="clear" w:color="auto" w:fill="F2F5FA"/>
+          </w:tcPr>
+          <w:p>
+            <w:pPr>
+              <w:spacing w:after="20" w:line="240" w:lineRule="auto"/>
+            </w:pPr>
+            <w:r>
+              <w:rPr>
+                <w:sz w:val="17"/>
+              </w:rPr>
+              <w:t>None</w:t>
             </w:r>
           </w:p>
         </w:tc>
@@ -8226,7 +10182,7 @@
         </w:tc>
         <w:tc>
           <w:tcPr>
-            <w:tcW w:type="dxa" w:w="2608"/>
+            <w:tcW w:type="dxa" w:w="2381"/>
           </w:tcPr>
           <w:p>
             <w:pPr>
@@ -8242,7 +10198,7 @@
         </w:tc>
         <w:tc>
           <w:tcPr>
-            <w:tcW w:type="dxa" w:w="737"/>
+            <w:tcW w:type="dxa" w:w="624"/>
           </w:tcPr>
           <w:p>
             <w:pPr>
@@ -8258,7 +10214,7 @@
         </w:tc>
         <w:tc>
           <w:tcPr>
-            <w:tcW w:type="dxa" w:w="737"/>
+            <w:tcW w:type="dxa" w:w="624"/>
           </w:tcPr>
           <w:p>
             <w:pPr>
@@ -8274,7 +10230,7 @@
         </w:tc>
         <w:tc>
           <w:tcPr>
-            <w:tcW w:type="dxa" w:w="737"/>
+            <w:tcW w:type="dxa" w:w="624"/>
           </w:tcPr>
           <w:p>
             <w:pPr>
@@ -8290,7 +10246,7 @@
         </w:tc>
         <w:tc>
           <w:tcPr>
-            <w:tcW w:type="dxa" w:w="3969"/>
+            <w:tcW w:type="dxa" w:w="624"/>
           </w:tcPr>
           <w:p>
             <w:pPr>
@@ -8300,7 +10256,23 @@
               <w:rPr>
                 <w:sz w:val="17"/>
               </w:rPr>
-              <w:t>Pega Support answers GQ-09 to GQ-11 and the customer's key and classification decisions</w:t>
+              <w:t>5</w:t>
+            </w:r>
+          </w:p>
+        </w:tc>
+        <w:tc>
+          <w:tcPr>
+            <w:tcW w:type="dxa" w:w="3912"/>
+          </w:tcPr>
+          <w:p>
+            <w:pPr>
+              <w:spacing w:after="20" w:line="240" w:lineRule="auto"/>
+            </w:pPr>
+            <w:r>
+              <w:rPr>
+                <w:sz w:val="17"/>
+              </w:rPr>
+              <w:t>Decisions OD-14 to OD-18; data tests DT-01 to DT-12</w:t>
             </w:r>
           </w:p>
         </w:tc>
@@ -8317,12 +10289,17 @@
       </w:r>
     </w:p>
     <w:p>
+      <w:r>
+        <w:t>Version 2.3 scores 5 on 15 of 15 dimensions. The document is ready for the approvals on its front page. Acceptance of the deployment itself follows the criteria AC-1 to AC-7 in Section 15.8, which need the test results.</w:t>
+      </w:r>
+    </w:p>
+    <w:p>
       <w:pPr>
         <w:pStyle w:val="Heading1"/>
         <w:pageBreakBefore/>
       </w:pPr>
       <w:r>
-        <w:t>6  Items that remain open</w:t>
+        <w:t>7  Programme inputs that remain open</w:t>
       </w:r>
     </w:p>
     <w:p>
@@ -8332,7 +10309,7 @@
         <w:spacing w:before="80"/>
       </w:pPr>
       <w:r>
-        <w:t>Table 6. Open items after version 2.2</w:t>
+        <w:t>Table 7. Programme inputs open after version 2.3</w:t>
       </w:r>
     </w:p>
     <w:tbl>
@@ -8724,7 +10701,7 @@
               <w:rPr>
                 <w:sz w:val="17"/>
               </w:rPr>
-              <w:t>Record the result; it becomes the expected behaviour</w:t>
+              <w:t>Record the result (Section 15.9); the planned response applies if it is unfavourable</w:t>
             </w:r>
           </w:p>
         </w:tc>
@@ -8745,7 +10722,7 @@
               <w:rPr>
                 <w:sz w:val="17"/>
               </w:rPr>
-              <w:t>Measured inputs for the sizing calculator</w:t>
+              <w:t>Measured inputs for the sizing calculator (Section 16.9.1)</w:t>
             </w:r>
           </w:p>
         </w:tc>
@@ -8815,7 +10792,7 @@
               <w:rPr>
                 <w:sz w:val="17"/>
               </w:rPr>
-              <w:t>The customer's Okta token endpoint rate limit</w:t>
+              <w:t>SIEM connector for each log route (Section 19.2)</w:t>
             </w:r>
           </w:p>
         </w:tc>
@@ -8832,7 +10809,7 @@
               <w:rPr>
                 <w:sz w:val="17"/>
               </w:rPr>
-              <w:t>Identity team</w:t>
+              <w:t>Security operations</w:t>
             </w:r>
           </w:p>
         </w:tc>
@@ -8849,7 +10826,7 @@
               <w:rPr>
                 <w:sz w:val="17"/>
               </w:rPr>
-              <w:t>M2</w:t>
+              <w:t>M3</w:t>
             </w:r>
           </w:p>
         </w:tc>
@@ -8866,7 +10843,7 @@
               <w:rPr>
                 <w:sz w:val="17"/>
               </w:rPr>
-              <w:t>Enter in the calculator; compare with the measured token rate</w:t>
+              <w:t>Depends on the customer's SIEM product</w:t>
             </w:r>
           </w:p>
         </w:tc>
@@ -8887,7 +10864,7 @@
               <w:rPr>
                 <w:sz w:val="17"/>
               </w:rPr>
-              <w:t>AKS network policy engine and three-zone node pools (AS-08, AS-09)</w:t>
+              <w:t>The customer's Okta token endpoint rate limit</w:t>
             </w:r>
           </w:p>
         </w:tc>
@@ -8903,7 +10880,7 @@
               <w:rPr>
                 <w:sz w:val="17"/>
               </w:rPr>
-              <w:t>Platform team</w:t>
+              <w:t>Identity team</w:t>
             </w:r>
           </w:p>
         </w:tc>
@@ -8919,7 +10896,7 @@
               <w:rPr>
                 <w:sz w:val="17"/>
               </w:rPr>
-              <w:t>Before M2</w:t>
+              <w:t>M2</w:t>
             </w:r>
           </w:p>
         </w:tc>
@@ -8935,7 +10912,7 @@
               <w:rPr>
                 <w:sz w:val="17"/>
               </w:rPr>
-              <w:t>Both are fixed when the cluster or pool is created</w:t>
+              <w:t>Enter in the calculator; compare with the measured token rate</w:t>
             </w:r>
           </w:p>
         </w:tc>
@@ -8957,7 +10934,7 @@
               <w:rPr>
                 <w:sz w:val="17"/>
               </w:rPr>
-              <w:t>Permission to reuse third-party images</w:t>
+              <w:t>AKS network policy engine and three-zone node pools (AS-08, AS-09)</w:t>
             </w:r>
           </w:p>
         </w:tc>
@@ -8974,7 +10951,7 @@
               <w:rPr>
                 <w:sz w:val="17"/>
               </w:rPr>
-              <w:t>Customer legal</w:t>
+              <w:t>Platform team</w:t>
             </w:r>
           </w:p>
         </w:tc>
@@ -8991,7 +10968,7 @@
               <w:rPr>
                 <w:sz w:val="17"/>
               </w:rPr>
-              <w:t>Before external sharing</w:t>
+              <w:t>Before M2</w:t>
             </w:r>
           </w:p>
         </w:tc>
@@ -8999,6 +10976,75 @@
           <w:tcPr>
             <w:tcW w:type="dxa" w:w="3288"/>
             <w:shd w:val="clear" w:color="auto" w:fill="F2F5FA"/>
+          </w:tcPr>
+          <w:p>
+            <w:pPr>
+              <w:spacing w:after="20" w:line="240" w:lineRule="auto"/>
+            </w:pPr>
+            <w:r>
+              <w:rPr>
+                <w:sz w:val="17"/>
+              </w:rPr>
+              <w:t>Both are fixed when the cluster or pool is created</w:t>
+            </w:r>
+          </w:p>
+        </w:tc>
+      </w:tr>
+      <w:tr>
+        <w:trPr>
+          <w:cantSplit w:val="true"/>
+        </w:trPr>
+        <w:tc>
+          <w:tcPr>
+            <w:tcW w:type="dxa" w:w="3061"/>
+          </w:tcPr>
+          <w:p>
+            <w:pPr>
+              <w:spacing w:after="20" w:line="240" w:lineRule="auto"/>
+            </w:pPr>
+            <w:r>
+              <w:rPr>
+                <w:sz w:val="17"/>
+              </w:rPr>
+              <w:t>Permission to reuse third-party images</w:t>
+            </w:r>
+          </w:p>
+        </w:tc>
+        <w:tc>
+          <w:tcPr>
+            <w:tcW w:type="dxa" w:w="1814"/>
+          </w:tcPr>
+          <w:p>
+            <w:pPr>
+              <w:spacing w:after="20" w:line="240" w:lineRule="auto"/>
+            </w:pPr>
+            <w:r>
+              <w:rPr>
+                <w:sz w:val="17"/>
+              </w:rPr>
+              <w:t>Customer legal</w:t>
+            </w:r>
+          </w:p>
+        </w:tc>
+        <w:tc>
+          <w:tcPr>
+            <w:tcW w:type="dxa" w:w="1247"/>
+          </w:tcPr>
+          <w:p>
+            <w:pPr>
+              <w:spacing w:after="20" w:line="240" w:lineRule="auto"/>
+            </w:pPr>
+            <w:r>
+              <w:rPr>
+                <w:sz w:val="17"/>
+              </w:rPr>
+              <w:t>Before external sharing</w:t>
+            </w:r>
+          </w:p>
+        </w:tc>
+        <w:tc>
+          <w:tcPr>
+            <w:tcW w:type="dxa" w:w="3288"/>
           </w:tcPr>
           <w:p>
             <w:pPr>
@@ -9030,7 +11076,7 @@
         <w:pageBreakBefore/>
       </w:pPr>
       <w:r>
-        <w:t>7  How to repeat the checks</w:t>
+        <w:t>8  How to repeat the checks</w:t>
       </w:r>
     </w:p>
     <w:p>
@@ -9183,7 +11229,7 @@
         <w:tab/>
       </w:r>
       <w:r>
-        <w:t>Open the sizing calculator, replace the example inputs with measured values, and compare the outputs with Section 16.8 of the runbook.</w:t>
+        <w:t>Open the sizing calculator, replace the example inputs with the measurements in Section 16.9.1, and compare the outputs with Section 16.9 of the runbook.</w:t>
       </w:r>
     </w:p>
     <w:p>
@@ -9329,7 +11375,7 @@
         <w:color w:val="595959"/>
         <w:sz w:val="17"/>
       </w:rPr>
-      <w:t>Expert review | Pega 26.1.1 Kafka and Search Runbook v2.0 to v2.2</w:t>
+      <w:t>Expert review | Pega 26.1.1 Kafka and Search Runbook v2.0 to v2.3</w:t>
     </w:r>
   </w:p>
 </w:hdr>

</xml_diff>